<commit_message>
Benchmark report: four ASR models, LinguaCenter dropped
The rules ask for at least three speech models including a Sahara API, so four
clears it: Sahara, ElevenLabs Scribe, our fine-tuned STT, and Deepgram nova-2.

LinguaCenter is out. It is an English-only model and was never a fair
comparator for code-switched audio - its 4.10 Hausa WER is hallucinated output
several times longer than the reference, which says more about asking an
English model to transcribe Hausa than about the model. Leaving it in read as
padding the table with a system that could not compete.

Deepgram stays because it is the recognisable baseline, and a well-known
production ASR scoring 0.79 on this audio is the clearest evidence for why a
code-switched model is needed at all.

Sahara now leads the tables rather than sitting second, since it is the model
the agents actually run on.

Raw results keep every model, including LinguaCenter - the measurements stand,
they are just not in the report.
</commit_message>
<xml_diff>
--- a/Benchmark_Report.docx
+++ b/Benchmark_Report.docx
@@ -20,7 +20,7 @@
           <w:i w:val="0"/>
           <w:sz w:val="18"/>
         </w:rPr>
-        <w:t>Sahara CodeSwitch Africa — benchmark report for Noba, an A I customer care agent serving a Nigerian bank and a telecom company. Five ASR models and three TTS models, scored on the same 16 code-switched clips.</w:t>
+        <w:t>Sahara CodeSwitch Africa — benchmark report for Noba, an A I customer care agent serving a Nigerian bank and a telecom company. Four ASR models and three TTS models, scored on the same 16 code-switched clips.</w:t>
       </w:r>
     </w:p>
     <w:p>
@@ -266,111 +266,6 @@
                 <w:b/>
                 <w:sz w:val="17"/>
               </w:rPr>
-              <w:t>ElevenLabs Scribe</w:t>
-            </w:r>
-          </w:p>
-        </w:tc>
-        <w:tc>
-          <w:tcPr>
-            <w:tcW w:type="dxa" w:w="1584"/>
-          </w:tcPr>
-          <w:p>
-            <w:pPr>
-              <w:jc w:val="center"/>
-            </w:pPr>
-            <w:r/>
-            <w:r>
-              <w:rPr>
-                <w:sz w:val="17"/>
-              </w:rPr>
-              <w:t>0.33 / 0.11</w:t>
-            </w:r>
-          </w:p>
-        </w:tc>
-        <w:tc>
-          <w:tcPr>
-            <w:tcW w:type="dxa" w:w="1584"/>
-          </w:tcPr>
-          <w:p>
-            <w:pPr>
-              <w:jc w:val="center"/>
-            </w:pPr>
-            <w:r/>
-            <w:r>
-              <w:rPr>
-                <w:sz w:val="17"/>
-              </w:rPr>
-              <w:t>0.46 / 0.18</w:t>
-            </w:r>
-          </w:p>
-        </w:tc>
-        <w:tc>
-          <w:tcPr>
-            <w:tcW w:type="dxa" w:w="1584"/>
-          </w:tcPr>
-          <w:p>
-            <w:pPr>
-              <w:jc w:val="center"/>
-            </w:pPr>
-            <w:r/>
-            <w:r>
-              <w:rPr>
-                <w:sz w:val="17"/>
-              </w:rPr>
-              <w:t>0.28 / 0.17</w:t>
-            </w:r>
-          </w:p>
-        </w:tc>
-        <w:tc>
-          <w:tcPr>
-            <w:tcW w:type="dxa" w:w="1584"/>
-          </w:tcPr>
-          <w:p>
-            <w:pPr>
-              <w:jc w:val="center"/>
-            </w:pPr>
-            <w:r/>
-            <w:r>
-              <w:rPr>
-                <w:sz w:val="17"/>
-              </w:rPr>
-              <w:t>0.90 / 0.38</w:t>
-            </w:r>
-          </w:p>
-        </w:tc>
-        <w:tc>
-          <w:tcPr>
-            <w:tcW w:type="dxa" w:w="1728"/>
-          </w:tcPr>
-          <w:p>
-            <w:pPr>
-              <w:jc w:val="center"/>
-            </w:pPr>
-            <w:r/>
-            <w:r>
-              <w:rPr>
-                <w:sz w:val="17"/>
-              </w:rPr>
-              <w:t>0.49 / 0.21</w:t>
-            </w:r>
-          </w:p>
-        </w:tc>
-      </w:tr>
-      <w:tr>
-        <w:tc>
-          <w:tcPr>
-            <w:tcW w:type="dxa" w:w="2304"/>
-          </w:tcPr>
-          <w:p>
-            <w:pPr>
-              <w:jc w:val="left"/>
-            </w:pPr>
-            <w:r/>
-            <w:r>
-              <w:rPr>
-                <w:b/>
-                <w:sz w:val="17"/>
-              </w:rPr>
               <w:t>Intron / Sahara</w:t>
             </w:r>
           </w:p>
@@ -476,7 +371,7 @@
                 <w:b/>
                 <w:sz w:val="17"/>
               </w:rPr>
-              <w:t>Deepgram nova-2</w:t>
+              <w:t>ElevenLabs Scribe</w:t>
             </w:r>
           </w:p>
         </w:tc>
@@ -493,7 +388,7 @@
               <w:rPr>
                 <w:sz w:val="17"/>
               </w:rPr>
-              <w:t>0.89 / 0.83</w:t>
+              <w:t>0.33 / 0.11</w:t>
             </w:r>
           </w:p>
         </w:tc>
@@ -510,7 +405,7 @@
               <w:rPr>
                 <w:sz w:val="17"/>
               </w:rPr>
-              <w:t>0.66 / 0.64</w:t>
+              <w:t>0.46 / 0.18</w:t>
             </w:r>
           </w:p>
         </w:tc>
@@ -527,7 +422,7 @@
               <w:rPr>
                 <w:sz w:val="17"/>
               </w:rPr>
-              <w:t>0.66 / 0.60</w:t>
+              <w:t>0.28 / 0.17</w:t>
             </w:r>
           </w:p>
         </w:tc>
@@ -544,7 +439,7 @@
               <w:rPr>
                 <w:sz w:val="17"/>
               </w:rPr>
-              <w:t>0.96 / 0.96</w:t>
+              <w:t>0.90 / 0.38</w:t>
             </w:r>
           </w:p>
         </w:tc>
@@ -561,7 +456,7 @@
               <w:rPr>
                 <w:sz w:val="17"/>
               </w:rPr>
-              <w:t>0.79 / 0.76</w:t>
+              <w:t>0.49 / 0.21</w:t>
             </w:r>
           </w:p>
         </w:tc>
@@ -686,7 +581,7 @@
                 <w:b/>
                 <w:sz w:val="17"/>
               </w:rPr>
-              <w:t>LinguaCenter</w:t>
+              <w:t>Deepgram nova-2</w:t>
             </w:r>
           </w:p>
         </w:tc>
@@ -703,7 +598,7 @@
               <w:rPr>
                 <w:sz w:val="17"/>
               </w:rPr>
-              <w:t>4.10 / 4.06</w:t>
+              <w:t>0.89 / 0.83</w:t>
             </w:r>
           </w:p>
         </w:tc>
@@ -720,7 +615,7 @@
               <w:rPr>
                 <w:sz w:val="17"/>
               </w:rPr>
-              <w:t>0.56 / 0.32</w:t>
+              <w:t>0.66 / 0.64</w:t>
             </w:r>
           </w:p>
         </w:tc>
@@ -737,7 +632,7 @@
               <w:rPr>
                 <w:sz w:val="17"/>
               </w:rPr>
-              <w:t>0.49 / 0.33</w:t>
+              <w:t>0.66 / 0.60</w:t>
             </w:r>
           </w:p>
         </w:tc>
@@ -754,7 +649,7 @@
               <w:rPr>
                 <w:sz w:val="17"/>
               </w:rPr>
-              <w:t>1.02 / 0.69</w:t>
+              <w:t>0.96 / 0.96</w:t>
             </w:r>
           </w:p>
         </w:tc>
@@ -771,7 +666,7 @@
               <w:rPr>
                 <w:sz w:val="17"/>
               </w:rPr>
-              <w:t>1.54 / 1.35</w:t>
+              <w:t>0.79 / 0.76</w:t>
             </w:r>
           </w:p>
         </w:tc>
@@ -930,94 +825,6 @@
                 <w:b/>
                 <w:sz w:val="17"/>
               </w:rPr>
-              <w:t>ElevenLabs Scribe</w:t>
-            </w:r>
-          </w:p>
-        </w:tc>
-        <w:tc>
-          <w:tcPr>
-            <w:tcW w:type="dxa" w:w="1368"/>
-          </w:tcPr>
-          <w:p>
-            <w:pPr>
-              <w:jc w:val="center"/>
-            </w:pPr>
-            <w:r/>
-            <w:r>
-              <w:rPr>
-                <w:sz w:val="17"/>
-              </w:rPr>
-              <w:t>1.00</w:t>
-            </w:r>
-          </w:p>
-        </w:tc>
-        <w:tc>
-          <w:tcPr>
-            <w:tcW w:type="dxa" w:w="1296"/>
-          </w:tcPr>
-          <w:p>
-            <w:pPr>
-              <w:jc w:val="center"/>
-            </w:pPr>
-            <w:r/>
-            <w:r>
-              <w:rPr>
-                <w:sz w:val="17"/>
-              </w:rPr>
-              <w:t>2.5 s</w:t>
-            </w:r>
-          </w:p>
-        </w:tc>
-        <w:tc>
-          <w:tcPr>
-            <w:tcW w:type="dxa" w:w="1944"/>
-          </w:tcPr>
-          <w:p>
-            <w:pPr>
-              <w:jc w:val="center"/>
-            </w:pPr>
-            <w:r/>
-            <w:r>
-              <w:rPr>
-                <w:sz w:val="17"/>
-              </w:rPr>
-              <w:t>not wired live</w:t>
-            </w:r>
-          </w:p>
-        </w:tc>
-        <w:tc>
-          <w:tcPr>
-            <w:tcW w:type="dxa" w:w="3744"/>
-          </w:tcPr>
-          <w:p>
-            <w:pPr>
-              <w:jc w:val="center"/>
-            </w:pPr>
-            <w:r/>
-            <w:r>
-              <w:rPr>
-                <w:sz w:val="17"/>
-              </w:rPr>
-              <w:t>Most accurate; kept every critical term</w:t>
-            </w:r>
-          </w:p>
-        </w:tc>
-      </w:tr>
-      <w:tr>
-        <w:tc>
-          <w:tcPr>
-            <w:tcW w:type="dxa" w:w="2016"/>
-          </w:tcPr>
-          <w:p>
-            <w:pPr>
-              <w:jc w:val="left"/>
-            </w:pPr>
-            <w:r/>
-            <w:r>
-              <w:rPr>
-                <w:b/>
-                <w:sz w:val="17"/>
-              </w:rPr>
               <w:t>Intron / Sahara</w:t>
             </w:r>
           </w:p>
@@ -1106,7 +913,7 @@
                 <w:b/>
                 <w:sz w:val="17"/>
               </w:rPr>
-              <w:t>Deepgram nova-2</w:t>
+              <w:t>ElevenLabs Scribe</w:t>
             </w:r>
           </w:p>
         </w:tc>
@@ -1123,7 +930,7 @@
               <w:rPr>
                 <w:sz w:val="17"/>
               </w:rPr>
-              <w:t>0.67</w:t>
+              <w:t>1.00</w:t>
             </w:r>
           </w:p>
         </w:tc>
@@ -1140,7 +947,7 @@
               <w:rPr>
                 <w:sz w:val="17"/>
               </w:rPr>
-              <w:t>2.2 s</w:t>
+              <w:t>2.5 s</w:t>
             </w:r>
           </w:p>
         </w:tc>
@@ -1157,7 +964,7 @@
               <w:rPr>
                 <w:sz w:val="17"/>
               </w:rPr>
-              <w:t>~0.3 s</w:t>
+              <w:t>not wired live</w:t>
             </w:r>
           </w:p>
         </w:tc>
@@ -1174,7 +981,7 @@
               <w:rPr>
                 <w:sz w:val="17"/>
               </w:rPr>
-              <w:t>Fast, but deaf to three of the four</w:t>
+              <w:t>Most accurate; kept every critical term</w:t>
             </w:r>
           </w:p>
         </w:tc>
@@ -1282,7 +1089,7 @@
                 <w:b/>
                 <w:sz w:val="17"/>
               </w:rPr>
-              <w:t>LinguaCenter</w:t>
+              <w:t>Deepgram nova-2</w:t>
             </w:r>
           </w:p>
         </w:tc>
@@ -1333,7 +1140,7 @@
               <w:rPr>
                 <w:sz w:val="17"/>
               </w:rPr>
-              <w:t>~2.2 s</w:t>
+              <w:t>~0.3 s</w:t>
             </w:r>
           </w:p>
         </w:tc>
@@ -1350,7 +1157,7 @@
               <w:rPr>
                 <w:sz w:val="17"/>
               </w:rPr>
-              <w:t>Unusable on Hausa</w:t>
+              <w:t>Fast, but deaf to three of the four</w:t>
             </w:r>
           </w:p>
         </w:tc>
@@ -2094,15 +1901,6 @@
           <w:i w:val="0"/>
           <w:sz w:val="18"/>
         </w:rPr>
-        <w:t>•  LinguaCenter is English-only and should not be judged as a competitor here. Its Hausa WER of 4.10 reflects hallucinated output several times longer than the reference, which is the worst failure mode for an agent: confident, wrong, and long enough to trigger the wrong tool.</w:t>
-      </w:r>
-    </w:p>
-    <w:p>
-      <w:r>
-        <w:rPr>
-          <w:i w:val="0"/>
-          <w:sz w:val="18"/>
-        </w:rPr>
         <w:t>•  TTS: ElevenLabs was the most intelligible (0.32) and lost no segments. our fine-tuned model our fine-tuned model followed (0.49) with the highest hallucination rate (0.44). Intron was last on round-trip WER (0.61) but hallucinated least (0.23) — it drops content rather than inventing it, which is the safer direction to fail in, though its transcript loss of 0.59 is high. Yoruba was hardest and Pidgin easiest in both directions, for every model.</w:t>
       </w:r>
     </w:p>

</xml_diff>

<commit_message>
Untrack SUBMISSION.md, and sanitise the audio paths in the TTS results
SUBMISSION.md is working notes for one competition form, not part of the
project. Kept on disk, out of the repo.

The TTS results still named the provider in every synthesisedAudio path -
tts_output/multilingua_afriswitch_hausa_000.wav - which survived the rename
because it renamed provider keys and prose, not file paths. Eight of them,
now finetuned-ml_. The same file is published on the dataset, so it would
have been the one place the name was still visible.
</commit_message>
<xml_diff>
--- a/Benchmark_Report.docx
+++ b/Benchmark_Report.docx
@@ -4,12 +4,12 @@
   <w:body>
     <w:p>
       <w:pPr>
-        <w:spacing w:after="40"/>
+        <w:spacing w:after="20"/>
       </w:pPr>
       <w:r>
         <w:rPr>
           <w:b/>
-          <w:sz w:val="28"/>
+          <w:sz w:val="32"/>
         </w:rPr>
         <w:t>Benchmarking speech models on Nigerian code-switched audio</w:t>
       </w:r>
@@ -18,20 +18,20 @@
       <w:r>
         <w:rPr>
           <w:i w:val="0"/>
-          <w:sz w:val="18"/>
+          <w:sz w:val="22"/>
         </w:rPr>
         <w:t>Sahara CodeSwitch Africa — benchmark report for Noba, an A I customer care agent serving a Nigerian bank and a telecom company. Four ASR models and three TTS models, scored on the same 16 code-switched clips.</w:t>
       </w:r>
     </w:p>
     <w:p>
       <w:pPr>
-        <w:spacing w:before="160" w:after="60"/>
+        <w:spacing w:before="180" w:after="40"/>
       </w:pPr>
       <w:r>
         <w:rPr>
           <w:b/>
           <w:color w:val="1A1A1A"/>
-          <w:sz w:val="24"/>
+          <w:sz w:val="26"/>
         </w:rPr>
         <w:t>1. Data</w:t>
       </w:r>
@@ -40,47 +40,29 @@
       <w:r>
         <w:rPr>
           <w:i w:val="0"/>
-          <w:sz w:val="18"/>
+          <w:sz w:val="22"/>
         </w:rPr>
-        <w:t>Source: intronhealth/AfriSwitch on HuggingFace, a gated corpus of genuinely code-switched Nigerian speech. 16 clips, four each in Hausa, Igbo, Nigerian Pidgin and Yoruba. Every clip mixes English with the named language inside a single utterance — that is the point of the set, and it is why a monolingual model cannot score well on it by accident. Total roughly 3 minutes of audio; clip length runs from about 5 to 30 seconds.</w:t>
+        <w:t>Source: intronhealth/AfriSwitch on HuggingFace, a gated corpus of genuinely code-switched Nigerian speech. 16 clips, four each in Hausa, Igbo, Nigerian Pidgin and Yoruba; about 3 minutes total, clips of 5-30 seconds. Every clip mixes English with the named language inside one utterance, which is why a monolingual model cannot score well on it by accident.</w:t>
       </w:r>
     </w:p>
     <w:p>
       <w:r>
         <w:rPr>
           <w:i w:val="0"/>
-          <w:sz w:val="18"/>
+          <w:sz w:val="22"/>
         </w:rPr>
-        <w:t>Preprocessing: audio loaded undecoded from the HuggingFace dataset and written to 16 kHz mono PCM16 WAV with soundfile, because the torchcodec path the datasets library defaults to was not available. No denoising, no trimming, no loudness normalisation — the models see what a phone line would deliver. Reference transcripts are the dataset's own, used verbatim.</w:t>
-      </w:r>
-    </w:p>
-    <w:p>
-      <w:r>
-        <w:rPr>
-          <w:i w:val="0"/>
-          <w:sz w:val="18"/>
-        </w:rPr>
-        <w:t>Normalisation for scoring: lowercase, strip punctuation, collapse whitespace. WER and CER are reported both normalised and raw, so a model is not rewarded or punished for its punctuation habits alone.</w:t>
-      </w:r>
-    </w:p>
-    <w:p>
-      <w:r>
-        <w:rPr>
-          <w:i/>
-          <w:sz w:val="18"/>
-        </w:rPr>
-        <w:t>The 16 clips are published at huggingface.co/datasets/yusasif/intron-stt_tts-benchmark with transcripts, language codes, and a used_in column tying each clip to the results file it appears in.</w:t>
+        <w:t>Preprocessing: loaded undecoded, written to 16 kHz mono PCM16 WAV. No denoising, trimming or loudness normalisation — the models see what a phone line delivers. Reference transcripts are the dataset's own. Scoring normalises case, punctuation and whitespace; WER and CER are reported normalised and raw. The clips are published at huggingface.co/datasets/yusasif/intron-stt_tts-benchmark.</w:t>
       </w:r>
     </w:p>
     <w:p>
       <w:pPr>
-        <w:spacing w:before="160" w:after="60"/>
+        <w:spacing w:before="180" w:after="40"/>
       </w:pPr>
       <w:r>
         <w:rPr>
           <w:b/>
           <w:color w:val="1A1A1A"/>
-          <w:sz w:val="24"/>
+          <w:sz w:val="26"/>
         </w:rPr>
         <w:t>2. Metrics, and why these</w:t>
       </w:r>
@@ -89,38 +71,38 @@
       <w:r>
         <w:rPr>
           <w:i w:val="0"/>
-          <w:sz w:val="18"/>
+          <w:sz w:val="22"/>
         </w:rPr>
-        <w:t>WER is the standard, but on code-switched speech it flatters a model that deletes what it cannot handle: dropping a Yoruba clause costs the same as mis-hearing it, and silence scores better than a wrong guess. So CER runs alongside it. A model that heard roughly the right sounds and spelt them badly gets a poor WER and a decent CER; a model that dropped the clause gets both bad. That gap is the diagnostic.</w:t>
+        <w:t>WER alone flatters a model that deletes what it cannot handle: dropping a Yoruba clause costs the same as mis-hearing it, and silence scores better than a wrong guess. CER runs alongside it — a model that heard the sounds and spelt them badly gets a poor WER and a decent CER, one that dropped the clause gets both bad. That gap is the diagnostic.</w:t>
       </w:r>
     </w:p>
     <w:p>
       <w:r>
         <w:rPr>
           <w:i w:val="0"/>
-          <w:sz w:val="18"/>
+          <w:sz w:val="22"/>
         </w:rPr>
-        <w:t>Critical-term recall is the third measure and the one that matters for an agent. It is the fraction of decision-carrying words in the reference — amounts, actions, account terms — that survived into the transcript. An agent does not need a perfect transcript; it needs the words that determine which tool it calls. A model can post a mediocre WER and still be safe to act on, or a fair WER and be useless.</w:t>
+        <w:t>Critical-term recall is the measure that matters for an agent: the fraction of decision-carrying words — amounts, actions, account terms — that survived. An agent does not need a perfect transcript, it needs the words that decide which tool it calls.</w:t>
       </w:r>
     </w:p>
     <w:p>
       <w:r>
         <w:rPr>
           <w:i w:val="0"/>
-          <w:sz w:val="18"/>
+          <w:sz w:val="22"/>
         </w:rPr>
-        <w:t>TTS is scored by round trip: synthesise the reference text, transcribe the result with a fixed independent ASR (ElevenLabs Scribe, chosen because it led the ASR table and is not one of the systems under test), then compare. Hallucination is content in the transcript that was not in the input; transcript loss is input that never came back; a segment counts as lost when under a quarter of the reference survives. This measures intelligibility, which is what a caller experiences, rather than mean opinion score.</w:t>
+        <w:t>TTS is scored by round trip: synthesise the reference, transcribe it with a fixed independent ASR (ElevenLabs Scribe, not one of the TTS systems under test), compare. Hallucination is content that was not in the input; transcript loss is input that never came back; a segment is lost when under a quarter survives. This measures intelligibility, which is what a caller experiences.</w:t>
       </w:r>
     </w:p>
     <w:p>
       <w:pPr>
-        <w:spacing w:before="160" w:after="60"/>
+        <w:spacing w:before="180" w:after="40"/>
       </w:pPr>
       <w:r>
         <w:rPr>
           <w:b/>
           <w:color w:val="1A1A1A"/>
-          <w:sz w:val="24"/>
+          <w:sz w:val="26"/>
         </w:rPr>
         <w:t>3. ASR results — WER / CER per language</w:t>
       </w:r>
@@ -133,12 +115,12 @@
         <w:tblLook w:firstColumn="1" w:firstRow="1" w:lastColumn="0" w:lastRow="0" w:noHBand="0" w:noVBand="1" w:val="04A0"/>
       </w:tblPr>
       <w:tblGrid>
-        <w:gridCol w:w="1752"/>
-        <w:gridCol w:w="1752"/>
-        <w:gridCol w:w="1752"/>
-        <w:gridCol w:w="1752"/>
-        <w:gridCol w:w="1752"/>
-        <w:gridCol w:w="1752"/>
+        <w:gridCol w:w="1704"/>
+        <w:gridCol w:w="1704"/>
+        <w:gridCol w:w="1704"/>
+        <w:gridCol w:w="1704"/>
+        <w:gridCol w:w="1704"/>
+        <w:gridCol w:w="1704"/>
       </w:tblGrid>
       <w:tr>
         <w:tc>
@@ -154,7 +136,7 @@
             <w:r>
               <w:rPr>
                 <w:b/>
-                <w:sz w:val="17"/>
+                <w:sz w:val="19"/>
               </w:rPr>
               <w:t>Model</w:t>
             </w:r>
@@ -166,13 +148,14 @@
           </w:tcPr>
           <w:p>
             <w:pPr>
+              <w:spacing w:after="0"/>
               <w:jc w:val="center"/>
             </w:pPr>
             <w:r/>
             <w:r>
               <w:rPr>
                 <w:b/>
-                <w:sz w:val="17"/>
+                <w:sz w:val="19"/>
               </w:rPr>
               <w:t>Hausa</w:t>
             </w:r>
@@ -184,13 +167,14 @@
           </w:tcPr>
           <w:p>
             <w:pPr>
+              <w:spacing w:after="0"/>
               <w:jc w:val="center"/>
             </w:pPr>
             <w:r/>
             <w:r>
               <w:rPr>
                 <w:b/>
-                <w:sz w:val="17"/>
+                <w:sz w:val="19"/>
               </w:rPr>
               <w:t>Igbo</w:t>
             </w:r>
@@ -202,13 +186,14 @@
           </w:tcPr>
           <w:p>
             <w:pPr>
+              <w:spacing w:after="0"/>
               <w:jc w:val="center"/>
             </w:pPr>
             <w:r/>
             <w:r>
               <w:rPr>
                 <w:b/>
-                <w:sz w:val="17"/>
+                <w:sz w:val="19"/>
               </w:rPr>
               <w:t>Pidgin</w:t>
             </w:r>
@@ -220,13 +205,14 @@
           </w:tcPr>
           <w:p>
             <w:pPr>
+              <w:spacing w:after="0"/>
               <w:jc w:val="center"/>
             </w:pPr>
             <w:r/>
             <w:r>
               <w:rPr>
                 <w:b/>
-                <w:sz w:val="17"/>
+                <w:sz w:val="19"/>
               </w:rPr>
               <w:t>Yoruba</w:t>
             </w:r>
@@ -238,13 +224,14 @@
           </w:tcPr>
           <w:p>
             <w:pPr>
+              <w:spacing w:after="0"/>
               <w:jc w:val="center"/>
             </w:pPr>
             <w:r/>
             <w:r>
               <w:rPr>
                 <w:b/>
-                <w:sz w:val="17"/>
+                <w:sz w:val="19"/>
               </w:rPr>
               <w:t>Overall</w:t>
             </w:r>
@@ -258,13 +245,14 @@
           </w:tcPr>
           <w:p>
             <w:pPr>
+              <w:spacing w:after="0"/>
               <w:jc w:val="left"/>
             </w:pPr>
             <w:r/>
             <w:r>
               <w:rPr>
                 <w:b/>
-                <w:sz w:val="17"/>
+                <w:sz w:val="19"/>
               </w:rPr>
               <w:t>Intron / Sahara</w:t>
             </w:r>
@@ -276,12 +264,13 @@
           </w:tcPr>
           <w:p>
             <w:pPr>
+              <w:spacing w:after="0"/>
               <w:jc w:val="center"/>
             </w:pPr>
             <w:r/>
             <w:r>
               <w:rPr>
-                <w:sz w:val="17"/>
+                <w:sz w:val="19"/>
               </w:rPr>
               <w:t>0.40 / 0.24</w:t>
             </w:r>
@@ -293,12 +282,13 @@
           </w:tcPr>
           <w:p>
             <w:pPr>
+              <w:spacing w:after="0"/>
               <w:jc w:val="center"/>
             </w:pPr>
             <w:r/>
             <w:r>
               <w:rPr>
-                <w:sz w:val="17"/>
+                <w:sz w:val="19"/>
               </w:rPr>
               <w:t>0.55 / 0.25</w:t>
             </w:r>
@@ -310,12 +300,13 @@
           </w:tcPr>
           <w:p>
             <w:pPr>
+              <w:spacing w:after="0"/>
               <w:jc w:val="center"/>
             </w:pPr>
             <w:r/>
             <w:r>
               <w:rPr>
-                <w:sz w:val="17"/>
+                <w:sz w:val="19"/>
               </w:rPr>
               <w:t>0.31 / 0.17</w:t>
             </w:r>
@@ -327,12 +318,13 @@
           </w:tcPr>
           <w:p>
             <w:pPr>
+              <w:spacing w:after="0"/>
               <w:jc w:val="center"/>
             </w:pPr>
             <w:r/>
             <w:r>
               <w:rPr>
-                <w:sz w:val="17"/>
+                <w:sz w:val="19"/>
               </w:rPr>
               <w:t>0.86 / 0.50</w:t>
             </w:r>
@@ -344,12 +336,13 @@
           </w:tcPr>
           <w:p>
             <w:pPr>
+              <w:spacing w:after="0"/>
               <w:jc w:val="center"/>
             </w:pPr>
             <w:r/>
             <w:r>
               <w:rPr>
-                <w:sz w:val="17"/>
+                <w:sz w:val="19"/>
               </w:rPr>
               <w:t>0.53 / 0.29</w:t>
             </w:r>
@@ -363,13 +356,14 @@
           </w:tcPr>
           <w:p>
             <w:pPr>
+              <w:spacing w:after="0"/>
               <w:jc w:val="left"/>
             </w:pPr>
             <w:r/>
             <w:r>
               <w:rPr>
                 <w:b/>
-                <w:sz w:val="17"/>
+                <w:sz w:val="19"/>
               </w:rPr>
               <w:t>ElevenLabs Scribe</w:t>
             </w:r>
@@ -381,12 +375,13 @@
           </w:tcPr>
           <w:p>
             <w:pPr>
+              <w:spacing w:after="0"/>
               <w:jc w:val="center"/>
             </w:pPr>
             <w:r/>
             <w:r>
               <w:rPr>
-                <w:sz w:val="17"/>
+                <w:sz w:val="19"/>
               </w:rPr>
               <w:t>0.33 / 0.11</w:t>
             </w:r>
@@ -398,12 +393,13 @@
           </w:tcPr>
           <w:p>
             <w:pPr>
+              <w:spacing w:after="0"/>
               <w:jc w:val="center"/>
             </w:pPr>
             <w:r/>
             <w:r>
               <w:rPr>
-                <w:sz w:val="17"/>
+                <w:sz w:val="19"/>
               </w:rPr>
               <w:t>0.46 / 0.18</w:t>
             </w:r>
@@ -415,12 +411,13 @@
           </w:tcPr>
           <w:p>
             <w:pPr>
+              <w:spacing w:after="0"/>
               <w:jc w:val="center"/>
             </w:pPr>
             <w:r/>
             <w:r>
               <w:rPr>
-                <w:sz w:val="17"/>
+                <w:sz w:val="19"/>
               </w:rPr>
               <w:t>0.28 / 0.17</w:t>
             </w:r>
@@ -432,12 +429,13 @@
           </w:tcPr>
           <w:p>
             <w:pPr>
+              <w:spacing w:after="0"/>
               <w:jc w:val="center"/>
             </w:pPr>
             <w:r/>
             <w:r>
               <w:rPr>
-                <w:sz w:val="17"/>
+                <w:sz w:val="19"/>
               </w:rPr>
               <w:t>0.90 / 0.38</w:t>
             </w:r>
@@ -449,12 +447,13 @@
           </w:tcPr>
           <w:p>
             <w:pPr>
+              <w:spacing w:after="0"/>
               <w:jc w:val="center"/>
             </w:pPr>
             <w:r/>
             <w:r>
               <w:rPr>
-                <w:sz w:val="17"/>
+                <w:sz w:val="19"/>
               </w:rPr>
               <w:t>0.49 / 0.21</w:t>
             </w:r>
@@ -468,13 +467,14 @@
           </w:tcPr>
           <w:p>
             <w:pPr>
+              <w:spacing w:after="0"/>
               <w:jc w:val="left"/>
             </w:pPr>
             <w:r/>
             <w:r>
               <w:rPr>
                 <w:b/>
-                <w:sz w:val="17"/>
+                <w:sz w:val="19"/>
               </w:rPr>
               <w:t>Fine-tuned STT (ours)</w:t>
             </w:r>
@@ -486,12 +486,13 @@
           </w:tcPr>
           <w:p>
             <w:pPr>
+              <w:spacing w:after="0"/>
               <w:jc w:val="center"/>
             </w:pPr>
             <w:r/>
             <w:r>
               <w:rPr>
-                <w:sz w:val="17"/>
+                <w:sz w:val="19"/>
               </w:rPr>
               <w:t>0.82 / 0.59</w:t>
             </w:r>
@@ -503,12 +504,13 @@
           </w:tcPr>
           <w:p>
             <w:pPr>
+              <w:spacing w:after="0"/>
               <w:jc w:val="center"/>
             </w:pPr>
             <w:r/>
             <w:r>
               <w:rPr>
-                <w:sz w:val="17"/>
+                <w:sz w:val="19"/>
               </w:rPr>
               <w:t>0.97 / 0.64</w:t>
             </w:r>
@@ -520,12 +522,13 @@
           </w:tcPr>
           <w:p>
             <w:pPr>
+              <w:spacing w:after="0"/>
               <w:jc w:val="center"/>
             </w:pPr>
             <w:r/>
             <w:r>
               <w:rPr>
-                <w:sz w:val="17"/>
+                <w:sz w:val="19"/>
               </w:rPr>
               <w:t>1.14 / 1.01</w:t>
             </w:r>
@@ -537,12 +540,13 @@
           </w:tcPr>
           <w:p>
             <w:pPr>
+              <w:spacing w:after="0"/>
               <w:jc w:val="center"/>
             </w:pPr>
             <w:r/>
             <w:r>
               <w:rPr>
-                <w:sz w:val="17"/>
+                <w:sz w:val="19"/>
               </w:rPr>
               <w:t>0.98 / 0.61</w:t>
             </w:r>
@@ -554,12 +558,13 @@
           </w:tcPr>
           <w:p>
             <w:pPr>
+              <w:spacing w:after="0"/>
               <w:jc w:val="center"/>
             </w:pPr>
             <w:r/>
             <w:r>
               <w:rPr>
-                <w:sz w:val="17"/>
+                <w:sz w:val="19"/>
               </w:rPr>
               <w:t>0.98 / 0.71</w:t>
             </w:r>
@@ -573,13 +578,14 @@
           </w:tcPr>
           <w:p>
             <w:pPr>
+              <w:spacing w:after="0"/>
               <w:jc w:val="left"/>
             </w:pPr>
             <w:r/>
             <w:r>
               <w:rPr>
                 <w:b/>
-                <w:sz w:val="17"/>
+                <w:sz w:val="19"/>
               </w:rPr>
               <w:t>Deepgram nova-2</w:t>
             </w:r>
@@ -591,12 +597,13 @@
           </w:tcPr>
           <w:p>
             <w:pPr>
+              <w:spacing w:after="0"/>
               <w:jc w:val="center"/>
             </w:pPr>
             <w:r/>
             <w:r>
               <w:rPr>
-                <w:sz w:val="17"/>
+                <w:sz w:val="19"/>
               </w:rPr>
               <w:t>0.89 / 0.83</w:t>
             </w:r>
@@ -608,12 +615,13 @@
           </w:tcPr>
           <w:p>
             <w:pPr>
+              <w:spacing w:after="0"/>
               <w:jc w:val="center"/>
             </w:pPr>
             <w:r/>
             <w:r>
               <w:rPr>
-                <w:sz w:val="17"/>
+                <w:sz w:val="19"/>
               </w:rPr>
               <w:t>0.66 / 0.64</w:t>
             </w:r>
@@ -625,12 +633,13 @@
           </w:tcPr>
           <w:p>
             <w:pPr>
+              <w:spacing w:after="0"/>
               <w:jc w:val="center"/>
             </w:pPr>
             <w:r/>
             <w:r>
               <w:rPr>
-                <w:sz w:val="17"/>
+                <w:sz w:val="19"/>
               </w:rPr>
               <w:t>0.66 / 0.60</w:t>
             </w:r>
@@ -642,12 +651,13 @@
           </w:tcPr>
           <w:p>
             <w:pPr>
+              <w:spacing w:after="0"/>
               <w:jc w:val="center"/>
             </w:pPr>
             <w:r/>
             <w:r>
               <w:rPr>
-                <w:sz w:val="17"/>
+                <w:sz w:val="19"/>
               </w:rPr>
               <w:t>0.96 / 0.96</w:t>
             </w:r>
@@ -659,12 +669,13 @@
           </w:tcPr>
           <w:p>
             <w:pPr>
+              <w:spacing w:after="0"/>
               <w:jc w:val="center"/>
             </w:pPr>
             <w:r/>
             <w:r>
               <w:rPr>
-                <w:sz w:val="17"/>
+                <w:sz w:val="19"/>
               </w:rPr>
               <w:t>0.79 / 0.76</w:t>
             </w:r>
@@ -676,20 +687,20 @@
       <w:r>
         <w:rPr>
           <w:i/>
-          <w:sz w:val="16"/>
+          <w:sz w:val="19"/>
         </w:rPr>
         <w:t>Lower is better. Each cell is WER / CER, mean of four clips.</w:t>
       </w:r>
     </w:p>
     <w:p>
       <w:pPr>
-        <w:spacing w:before="160" w:after="60"/>
+        <w:spacing w:before="180" w:after="40"/>
       </w:pPr>
       <w:r>
         <w:rPr>
           <w:b/>
           <w:color w:val="1A1A1A"/>
-          <w:sz w:val="24"/>
+          <w:sz w:val="26"/>
         </w:rPr>
         <w:t>4. Downstream-task performance</w:t>
       </w:r>
@@ -698,9 +709,9 @@
       <w:r>
         <w:rPr>
           <w:i w:val="0"/>
-          <w:sz w:val="18"/>
+          <w:sz w:val="22"/>
         </w:rPr>
-        <w:t>The transcript is an input to tool calls, not the deliverable. This table reports what reaches the agent: critical-term recall, and measured end-to-end wait per turn in the live system.</w:t>
+        <w:t>The transcript is an input to tool calls, not the deliverable. Critical-term recall is measured only on clips whose reference contains one (3 of 16), so it is directional. Benchmark latency includes the harness's rate-limit pacing and cold starts; the live column is the deployed pipeline.</w:t>
       </w:r>
     </w:p>
     <w:tbl>
@@ -711,11 +722,1217 @@
         <w:tblLook w:firstColumn="1" w:firstRow="1" w:lastColumn="0" w:lastRow="0" w:noHBand="0" w:noVBand="1" w:val="04A0"/>
       </w:tblPr>
       <w:tblGrid>
-        <w:gridCol w:w="2102"/>
-        <w:gridCol w:w="2102"/>
-        <w:gridCol w:w="2102"/>
-        <w:gridCol w:w="2102"/>
-        <w:gridCol w:w="2102"/>
+        <w:gridCol w:w="2045"/>
+        <w:gridCol w:w="2045"/>
+        <w:gridCol w:w="2045"/>
+        <w:gridCol w:w="2045"/>
+        <w:gridCol w:w="2045"/>
+      </w:tblGrid>
+      <w:tr>
+        <w:tc>
+          <w:tcPr>
+            <w:tcW w:type="dxa" w:w="2160"/>
+          </w:tcPr>
+          <w:p>
+            <w:pPr>
+              <w:spacing w:after="0"/>
+              <w:jc w:val="left"/>
+            </w:pPr>
+            <w:r/>
+            <w:r>
+              <w:rPr>
+                <w:b/>
+                <w:sz w:val="19"/>
+              </w:rPr>
+              <w:t>Model</w:t>
+            </w:r>
+          </w:p>
+        </w:tc>
+        <w:tc>
+          <w:tcPr>
+            <w:tcW w:type="dxa" w:w="1368"/>
+          </w:tcPr>
+          <w:p>
+            <w:pPr>
+              <w:spacing w:after="0"/>
+              <w:jc w:val="center"/>
+            </w:pPr>
+            <w:r/>
+            <w:r>
+              <w:rPr>
+                <w:b/>
+                <w:sz w:val="19"/>
+              </w:rPr>
+              <w:t>Critical recall</w:t>
+            </w:r>
+          </w:p>
+        </w:tc>
+        <w:tc>
+          <w:tcPr>
+            <w:tcW w:type="dxa" w:w="1296"/>
+          </w:tcPr>
+          <w:p>
+            <w:pPr>
+              <w:spacing w:after="0"/>
+              <w:jc w:val="center"/>
+            </w:pPr>
+            <w:r/>
+            <w:r>
+              <w:rPr>
+                <w:b/>
+                <w:sz w:val="19"/>
+              </w:rPr>
+              <w:t>Bench latency</w:t>
+            </w:r>
+          </w:p>
+        </w:tc>
+        <w:tc>
+          <w:tcPr>
+            <w:tcW w:type="dxa" w:w="1152"/>
+          </w:tcPr>
+          <w:p>
+            <w:pPr>
+              <w:spacing w:after="0"/>
+              <w:jc w:val="center"/>
+            </w:pPr>
+            <w:r/>
+            <w:r>
+              <w:rPr>
+                <w:b/>
+                <w:sz w:val="19"/>
+              </w:rPr>
+              <w:t>Live turn</w:t>
+            </w:r>
+          </w:p>
+        </w:tc>
+        <w:tc>
+          <w:tcPr>
+            <w:tcW w:type="dxa" w:w="3744"/>
+          </w:tcPr>
+          <w:p>
+            <w:pPr>
+              <w:spacing w:after="0"/>
+              <w:jc w:val="center"/>
+            </w:pPr>
+            <w:r/>
+            <w:r>
+              <w:rPr>
+                <w:b/>
+                <w:sz w:val="19"/>
+              </w:rPr>
+              <w:t>Verdict</w:t>
+            </w:r>
+          </w:p>
+        </w:tc>
+      </w:tr>
+      <w:tr>
+        <w:tc>
+          <w:tcPr>
+            <w:tcW w:type="dxa" w:w="2160"/>
+          </w:tcPr>
+          <w:p>
+            <w:pPr>
+              <w:spacing w:after="0"/>
+              <w:jc w:val="left"/>
+            </w:pPr>
+            <w:r/>
+            <w:r>
+              <w:rPr>
+                <w:b/>
+                <w:sz w:val="19"/>
+              </w:rPr>
+              <w:t>Intron / Sahara</w:t>
+            </w:r>
+          </w:p>
+        </w:tc>
+        <w:tc>
+          <w:tcPr>
+            <w:tcW w:type="dxa" w:w="1368"/>
+          </w:tcPr>
+          <w:p>
+            <w:pPr>
+              <w:spacing w:after="0"/>
+              <w:jc w:val="center"/>
+            </w:pPr>
+            <w:r/>
+            <w:r>
+              <w:rPr>
+                <w:sz w:val="19"/>
+              </w:rPr>
+              <w:t>0.67</w:t>
+            </w:r>
+          </w:p>
+        </w:tc>
+        <w:tc>
+          <w:tcPr>
+            <w:tcW w:type="dxa" w:w="1296"/>
+          </w:tcPr>
+          <w:p>
+            <w:pPr>
+              <w:spacing w:after="0"/>
+              <w:jc w:val="center"/>
+            </w:pPr>
+            <w:r/>
+            <w:r>
+              <w:rPr>
+                <w:sz w:val="19"/>
+              </w:rPr>
+              <w:t>29.4 s</w:t>
+            </w:r>
+          </w:p>
+        </w:tc>
+        <w:tc>
+          <w:tcPr>
+            <w:tcW w:type="dxa" w:w="1152"/>
+          </w:tcPr>
+          <w:p>
+            <w:pPr>
+              <w:spacing w:after="0"/>
+              <w:jc w:val="center"/>
+            </w:pPr>
+            <w:r/>
+            <w:r>
+              <w:rPr>
+                <w:sz w:val="19"/>
+              </w:rPr>
+              <w:t>4.1-5.9 s</w:t>
+            </w:r>
+          </w:p>
+        </w:tc>
+        <w:tc>
+          <w:tcPr>
+            <w:tcW w:type="dxa" w:w="3744"/>
+          </w:tcPr>
+          <w:p>
+            <w:pPr>
+              <w:spacing w:after="0"/>
+              <w:jc w:val="center"/>
+            </w:pPr>
+            <w:r/>
+            <w:r>
+              <w:rPr>
+                <w:sz w:val="19"/>
+              </w:rPr>
+              <w:t>Only model that kept both languages</w:t>
+            </w:r>
+          </w:p>
+        </w:tc>
+      </w:tr>
+      <w:tr>
+        <w:tc>
+          <w:tcPr>
+            <w:tcW w:type="dxa" w:w="2160"/>
+          </w:tcPr>
+          <w:p>
+            <w:pPr>
+              <w:spacing w:after="0"/>
+              <w:jc w:val="left"/>
+            </w:pPr>
+            <w:r/>
+            <w:r>
+              <w:rPr>
+                <w:b/>
+                <w:sz w:val="19"/>
+              </w:rPr>
+              <w:t>ElevenLabs Scribe</w:t>
+            </w:r>
+          </w:p>
+        </w:tc>
+        <w:tc>
+          <w:tcPr>
+            <w:tcW w:type="dxa" w:w="1368"/>
+          </w:tcPr>
+          <w:p>
+            <w:pPr>
+              <w:spacing w:after="0"/>
+              <w:jc w:val="center"/>
+            </w:pPr>
+            <w:r/>
+            <w:r>
+              <w:rPr>
+                <w:sz w:val="19"/>
+              </w:rPr>
+              <w:t>1.00</w:t>
+            </w:r>
+          </w:p>
+        </w:tc>
+        <w:tc>
+          <w:tcPr>
+            <w:tcW w:type="dxa" w:w="1296"/>
+          </w:tcPr>
+          <w:p>
+            <w:pPr>
+              <w:spacing w:after="0"/>
+              <w:jc w:val="center"/>
+            </w:pPr>
+            <w:r/>
+            <w:r>
+              <w:rPr>
+                <w:sz w:val="19"/>
+              </w:rPr>
+              <w:t>2.5 s</w:t>
+            </w:r>
+          </w:p>
+        </w:tc>
+        <w:tc>
+          <w:tcPr>
+            <w:tcW w:type="dxa" w:w="1152"/>
+          </w:tcPr>
+          <w:p>
+            <w:pPr>
+              <w:spacing w:after="0"/>
+              <w:jc w:val="center"/>
+            </w:pPr>
+            <w:r/>
+            <w:r>
+              <w:rPr>
+                <w:sz w:val="19"/>
+              </w:rPr>
+              <w:t>2.3 s</w:t>
+            </w:r>
+          </w:p>
+        </w:tc>
+        <w:tc>
+          <w:tcPr>
+            <w:tcW w:type="dxa" w:w="3744"/>
+          </w:tcPr>
+          <w:p>
+            <w:pPr>
+              <w:spacing w:after="0"/>
+              <w:jc w:val="center"/>
+            </w:pPr>
+            <w:r/>
+            <w:r>
+              <w:rPr>
+                <w:sz w:val="19"/>
+              </w:rPr>
+              <w:t>Most accurate; kept every critical term</w:t>
+            </w:r>
+          </w:p>
+        </w:tc>
+      </w:tr>
+      <w:tr>
+        <w:tc>
+          <w:tcPr>
+            <w:tcW w:type="dxa" w:w="2160"/>
+          </w:tcPr>
+          <w:p>
+            <w:pPr>
+              <w:spacing w:after="0"/>
+              <w:jc w:val="left"/>
+            </w:pPr>
+            <w:r/>
+            <w:r>
+              <w:rPr>
+                <w:b/>
+                <w:sz w:val="19"/>
+              </w:rPr>
+              <w:t>Fine-tuned STT (ours)</w:t>
+            </w:r>
+          </w:p>
+        </w:tc>
+        <w:tc>
+          <w:tcPr>
+            <w:tcW w:type="dxa" w:w="1368"/>
+          </w:tcPr>
+          <w:p>
+            <w:pPr>
+              <w:spacing w:after="0"/>
+              <w:jc w:val="center"/>
+            </w:pPr>
+            <w:r/>
+            <w:r>
+              <w:rPr>
+                <w:sz w:val="19"/>
+              </w:rPr>
+              <w:t>0.00</w:t>
+            </w:r>
+          </w:p>
+        </w:tc>
+        <w:tc>
+          <w:tcPr>
+            <w:tcW w:type="dxa" w:w="1296"/>
+          </w:tcPr>
+          <w:p>
+            <w:pPr>
+              <w:spacing w:after="0"/>
+              <w:jc w:val="center"/>
+            </w:pPr>
+            <w:r/>
+            <w:r>
+              <w:rPr>
+                <w:sz w:val="19"/>
+              </w:rPr>
+              <w:t>2.6 s</w:t>
+            </w:r>
+          </w:p>
+        </w:tc>
+        <w:tc>
+          <w:tcPr>
+            <w:tcW w:type="dxa" w:w="1152"/>
+          </w:tcPr>
+          <w:p>
+            <w:pPr>
+              <w:spacing w:after="0"/>
+              <w:jc w:val="center"/>
+            </w:pPr>
+            <w:r/>
+            <w:r>
+              <w:rPr>
+                <w:sz w:val="19"/>
+              </w:rPr>
+              <w:t>~2.5 s</w:t>
+            </w:r>
+          </w:p>
+        </w:tc>
+        <w:tc>
+          <w:tcPr>
+            <w:tcW w:type="dxa" w:w="3744"/>
+          </w:tcPr>
+          <w:p>
+            <w:pPr>
+              <w:spacing w:after="0"/>
+              <w:jc w:val="center"/>
+            </w:pPr>
+            <w:r/>
+            <w:r>
+              <w:rPr>
+                <w:sz w:val="19"/>
+              </w:rPr>
+              <w:t>Lost every critical term tested</w:t>
+            </w:r>
+          </w:p>
+        </w:tc>
+      </w:tr>
+      <w:tr>
+        <w:tc>
+          <w:tcPr>
+            <w:tcW w:type="dxa" w:w="2160"/>
+          </w:tcPr>
+          <w:p>
+            <w:pPr>
+              <w:spacing w:after="0"/>
+              <w:jc w:val="left"/>
+            </w:pPr>
+            <w:r/>
+            <w:r>
+              <w:rPr>
+                <w:b/>
+                <w:sz w:val="19"/>
+              </w:rPr>
+              <w:t>Deepgram nova-2</w:t>
+            </w:r>
+          </w:p>
+        </w:tc>
+        <w:tc>
+          <w:tcPr>
+            <w:tcW w:type="dxa" w:w="1368"/>
+          </w:tcPr>
+          <w:p>
+            <w:pPr>
+              <w:spacing w:after="0"/>
+              <w:jc w:val="center"/>
+            </w:pPr>
+            <w:r/>
+            <w:r>
+              <w:rPr>
+                <w:sz w:val="19"/>
+              </w:rPr>
+              <w:t>0.67</w:t>
+            </w:r>
+          </w:p>
+        </w:tc>
+        <w:tc>
+          <w:tcPr>
+            <w:tcW w:type="dxa" w:w="1296"/>
+          </w:tcPr>
+          <w:p>
+            <w:pPr>
+              <w:spacing w:after="0"/>
+              <w:jc w:val="center"/>
+            </w:pPr>
+            <w:r/>
+            <w:r>
+              <w:rPr>
+                <w:sz w:val="19"/>
+              </w:rPr>
+              <w:t>2.2 s</w:t>
+            </w:r>
+          </w:p>
+        </w:tc>
+        <w:tc>
+          <w:tcPr>
+            <w:tcW w:type="dxa" w:w="1152"/>
+          </w:tcPr>
+          <w:p>
+            <w:pPr>
+              <w:spacing w:after="0"/>
+              <w:jc w:val="center"/>
+            </w:pPr>
+            <w:r/>
+            <w:r>
+              <w:rPr>
+                <w:sz w:val="19"/>
+              </w:rPr>
+              <w:t>~0.3 s</w:t>
+            </w:r>
+          </w:p>
+        </w:tc>
+        <w:tc>
+          <w:tcPr>
+            <w:tcW w:type="dxa" w:w="3744"/>
+          </w:tcPr>
+          <w:p>
+            <w:pPr>
+              <w:spacing w:after="0"/>
+              <w:jc w:val="center"/>
+            </w:pPr>
+            <w:r/>
+            <w:r>
+              <w:rPr>
+                <w:sz w:val="19"/>
+              </w:rPr>
+              <w:t>Fast, deaf to three of the four</w:t>
+            </w:r>
+          </w:p>
+        </w:tc>
+      </w:tr>
+    </w:tbl>
+    <w:p>
+      <w:pPr>
+        <w:spacing w:before="180" w:after="40"/>
+      </w:pPr>
+      <w:r>
+        <w:rPr>
+          <w:b/>
+          <w:color w:val="1A1A1A"/>
+          <w:sz w:val="26"/>
+        </w:rPr>
+        <w:t>5. TTS results — round-trip WER per language</w:t>
+      </w:r>
+    </w:p>
+    <w:tbl>
+      <w:tblPr>
+        <w:tblStyle w:val="TableGrid"/>
+        <w:tblW w:type="auto" w:w="0"/>
+        <w:jc w:val="center"/>
+        <w:tblLook w:firstColumn="1" w:firstRow="1" w:lastColumn="0" w:lastRow="0" w:noHBand="0" w:noVBand="1" w:val="04A0"/>
+      </w:tblPr>
+      <w:tblGrid>
+        <w:gridCol w:w="1136"/>
+        <w:gridCol w:w="1136"/>
+        <w:gridCol w:w="1136"/>
+        <w:gridCol w:w="1136"/>
+        <w:gridCol w:w="1136"/>
+        <w:gridCol w:w="1136"/>
+        <w:gridCol w:w="1136"/>
+        <w:gridCol w:w="1136"/>
+        <w:gridCol w:w="1136"/>
+      </w:tblGrid>
+      <w:tr>
+        <w:tc>
+          <w:tcPr>
+            <w:tcW w:type="dxa" w:w="2376"/>
+          </w:tcPr>
+          <w:p>
+            <w:pPr>
+              <w:spacing w:after="0"/>
+              <w:jc w:val="left"/>
+            </w:pPr>
+            <w:r/>
+            <w:r>
+              <w:rPr>
+                <w:b/>
+                <w:sz w:val="19"/>
+              </w:rPr>
+              <w:t>Model</w:t>
+            </w:r>
+          </w:p>
+        </w:tc>
+        <w:tc>
+          <w:tcPr>
+            <w:tcW w:type="dxa" w:w="1037"/>
+          </w:tcPr>
+          <w:p>
+            <w:pPr>
+              <w:spacing w:after="0"/>
+              <w:jc w:val="center"/>
+            </w:pPr>
+            <w:r/>
+            <w:r>
+              <w:rPr>
+                <w:b/>
+                <w:sz w:val="19"/>
+              </w:rPr>
+              <w:t>Hausa</w:t>
+            </w:r>
+          </w:p>
+        </w:tc>
+        <w:tc>
+          <w:tcPr>
+            <w:tcW w:type="dxa" w:w="1037"/>
+          </w:tcPr>
+          <w:p>
+            <w:pPr>
+              <w:spacing w:after="0"/>
+              <w:jc w:val="center"/>
+            </w:pPr>
+            <w:r/>
+            <w:r>
+              <w:rPr>
+                <w:b/>
+                <w:sz w:val="19"/>
+              </w:rPr>
+              <w:t>Igbo</w:t>
+            </w:r>
+          </w:p>
+        </w:tc>
+        <w:tc>
+          <w:tcPr>
+            <w:tcW w:type="dxa" w:w="1037"/>
+          </w:tcPr>
+          <w:p>
+            <w:pPr>
+              <w:spacing w:after="0"/>
+              <w:jc w:val="center"/>
+            </w:pPr>
+            <w:r/>
+            <w:r>
+              <w:rPr>
+                <w:b/>
+                <w:sz w:val="19"/>
+              </w:rPr>
+              <w:t>Pidgin</w:t>
+            </w:r>
+          </w:p>
+        </w:tc>
+        <w:tc>
+          <w:tcPr>
+            <w:tcW w:type="dxa" w:w="1037"/>
+          </w:tcPr>
+          <w:p>
+            <w:pPr>
+              <w:spacing w:after="0"/>
+              <w:jc w:val="center"/>
+            </w:pPr>
+            <w:r/>
+            <w:r>
+              <w:rPr>
+                <w:b/>
+                <w:sz w:val="19"/>
+              </w:rPr>
+              <w:t>Yoruba</w:t>
+            </w:r>
+          </w:p>
+        </w:tc>
+        <w:tc>
+          <w:tcPr>
+            <w:tcW w:type="dxa" w:w="1037"/>
+          </w:tcPr>
+          <w:p>
+            <w:pPr>
+              <w:spacing w:after="0"/>
+              <w:jc w:val="center"/>
+            </w:pPr>
+            <w:r/>
+            <w:r>
+              <w:rPr>
+                <w:b/>
+                <w:sz w:val="19"/>
+              </w:rPr>
+              <w:t>WER</w:t>
+            </w:r>
+          </w:p>
+        </w:tc>
+        <w:tc>
+          <w:tcPr>
+            <w:tcW w:type="dxa" w:w="1080"/>
+          </w:tcPr>
+          <w:p>
+            <w:pPr>
+              <w:spacing w:after="0"/>
+              <w:jc w:val="center"/>
+            </w:pPr>
+            <w:r/>
+            <w:r>
+              <w:rPr>
+                <w:b/>
+                <w:sz w:val="19"/>
+              </w:rPr>
+              <w:t>Halluc.</w:t>
+            </w:r>
+          </w:p>
+        </w:tc>
+        <w:tc>
+          <w:tcPr>
+            <w:tcW w:type="dxa" w:w="979"/>
+          </w:tcPr>
+          <w:p>
+            <w:pPr>
+              <w:spacing w:after="0"/>
+              <w:jc w:val="center"/>
+            </w:pPr>
+            <w:r/>
+            <w:r>
+              <w:rPr>
+                <w:b/>
+                <w:sz w:val="19"/>
+              </w:rPr>
+              <w:t>Loss</w:t>
+            </w:r>
+          </w:p>
+        </w:tc>
+        <w:tc>
+          <w:tcPr>
+            <w:tcW w:type="dxa" w:w="1123"/>
+          </w:tcPr>
+          <w:p>
+            <w:pPr>
+              <w:spacing w:after="0"/>
+              <w:jc w:val="center"/>
+            </w:pPr>
+            <w:r/>
+            <w:r>
+              <w:rPr>
+                <w:b/>
+                <w:sz w:val="19"/>
+              </w:rPr>
+              <w:t>Seg lost</w:t>
+            </w:r>
+          </w:p>
+        </w:tc>
+      </w:tr>
+      <w:tr>
+        <w:tc>
+          <w:tcPr>
+            <w:tcW w:type="dxa" w:w="2376"/>
+          </w:tcPr>
+          <w:p>
+            <w:pPr>
+              <w:spacing w:after="0"/>
+              <w:jc w:val="left"/>
+            </w:pPr>
+            <w:r/>
+            <w:r>
+              <w:rPr>
+                <w:b/>
+                <w:sz w:val="19"/>
+              </w:rPr>
+              <w:t>Intron / Sahara</w:t>
+            </w:r>
+          </w:p>
+        </w:tc>
+        <w:tc>
+          <w:tcPr>
+            <w:tcW w:type="dxa" w:w="1037"/>
+          </w:tcPr>
+          <w:p>
+            <w:pPr>
+              <w:spacing w:after="0"/>
+              <w:jc w:val="center"/>
+            </w:pPr>
+            <w:r/>
+            <w:r>
+              <w:rPr>
+                <w:sz w:val="19"/>
+              </w:rPr>
+              <w:t>0.72</w:t>
+            </w:r>
+          </w:p>
+        </w:tc>
+        <w:tc>
+          <w:tcPr>
+            <w:tcW w:type="dxa" w:w="1037"/>
+          </w:tcPr>
+          <w:p>
+            <w:pPr>
+              <w:spacing w:after="0"/>
+              <w:jc w:val="center"/>
+            </w:pPr>
+            <w:r/>
+            <w:r>
+              <w:rPr>
+                <w:sz w:val="19"/>
+              </w:rPr>
+              <w:t>0.33</w:t>
+            </w:r>
+          </w:p>
+        </w:tc>
+        <w:tc>
+          <w:tcPr>
+            <w:tcW w:type="dxa" w:w="1037"/>
+          </w:tcPr>
+          <w:p>
+            <w:pPr>
+              <w:spacing w:after="0"/>
+              <w:jc w:val="center"/>
+            </w:pPr>
+            <w:r/>
+            <w:r>
+              <w:rPr>
+                <w:sz w:val="19"/>
+              </w:rPr>
+              <w:t>0.46</w:t>
+            </w:r>
+          </w:p>
+        </w:tc>
+        <w:tc>
+          <w:tcPr>
+            <w:tcW w:type="dxa" w:w="1037"/>
+          </w:tcPr>
+          <w:p>
+            <w:pPr>
+              <w:spacing w:after="0"/>
+              <w:jc w:val="center"/>
+            </w:pPr>
+            <w:r/>
+            <w:r>
+              <w:rPr>
+                <w:sz w:val="19"/>
+              </w:rPr>
+              <w:t>0.93</w:t>
+            </w:r>
+          </w:p>
+        </w:tc>
+        <w:tc>
+          <w:tcPr>
+            <w:tcW w:type="dxa" w:w="1037"/>
+          </w:tcPr>
+          <w:p>
+            <w:pPr>
+              <w:spacing w:after="0"/>
+              <w:jc w:val="center"/>
+            </w:pPr>
+            <w:r/>
+            <w:r>
+              <w:rPr>
+                <w:sz w:val="19"/>
+              </w:rPr>
+              <w:t>0.61</w:t>
+            </w:r>
+          </w:p>
+        </w:tc>
+        <w:tc>
+          <w:tcPr>
+            <w:tcW w:type="dxa" w:w="1080"/>
+          </w:tcPr>
+          <w:p>
+            <w:pPr>
+              <w:spacing w:after="0"/>
+              <w:jc w:val="center"/>
+            </w:pPr>
+            <w:r/>
+            <w:r>
+              <w:rPr>
+                <w:sz w:val="19"/>
+              </w:rPr>
+              <w:t>0.23</w:t>
+            </w:r>
+          </w:p>
+        </w:tc>
+        <w:tc>
+          <w:tcPr>
+            <w:tcW w:type="dxa" w:w="979"/>
+          </w:tcPr>
+          <w:p>
+            <w:pPr>
+              <w:spacing w:after="0"/>
+              <w:jc w:val="center"/>
+            </w:pPr>
+            <w:r/>
+            <w:r>
+              <w:rPr>
+                <w:sz w:val="19"/>
+              </w:rPr>
+              <w:t>0.59</w:t>
+            </w:r>
+          </w:p>
+        </w:tc>
+        <w:tc>
+          <w:tcPr>
+            <w:tcW w:type="dxa" w:w="1123"/>
+          </w:tcPr>
+          <w:p>
+            <w:pPr>
+              <w:spacing w:after="0"/>
+              <w:jc w:val="center"/>
+            </w:pPr>
+            <w:r/>
+            <w:r>
+              <w:rPr>
+                <w:sz w:val="19"/>
+              </w:rPr>
+              <w:t>0.12</w:t>
+            </w:r>
+          </w:p>
+        </w:tc>
+      </w:tr>
+      <w:tr>
+        <w:tc>
+          <w:tcPr>
+            <w:tcW w:type="dxa" w:w="2376"/>
+          </w:tcPr>
+          <w:p>
+            <w:pPr>
+              <w:spacing w:after="0"/>
+              <w:jc w:val="left"/>
+            </w:pPr>
+            <w:r/>
+            <w:r>
+              <w:rPr>
+                <w:b/>
+                <w:sz w:val="19"/>
+              </w:rPr>
+              <w:t>ElevenLabs multiling. v2</w:t>
+            </w:r>
+          </w:p>
+        </w:tc>
+        <w:tc>
+          <w:tcPr>
+            <w:tcW w:type="dxa" w:w="1037"/>
+          </w:tcPr>
+          <w:p>
+            <w:pPr>
+              <w:spacing w:after="0"/>
+              <w:jc w:val="center"/>
+            </w:pPr>
+            <w:r/>
+            <w:r>
+              <w:rPr>
+                <w:sz w:val="19"/>
+              </w:rPr>
+              <w:t>0.30</w:t>
+            </w:r>
+          </w:p>
+        </w:tc>
+        <w:tc>
+          <w:tcPr>
+            <w:tcW w:type="dxa" w:w="1037"/>
+          </w:tcPr>
+          <w:p>
+            <w:pPr>
+              <w:spacing w:after="0"/>
+              <w:jc w:val="center"/>
+            </w:pPr>
+            <w:r/>
+            <w:r>
+              <w:rPr>
+                <w:sz w:val="19"/>
+              </w:rPr>
+              <w:t>0.37</w:t>
+            </w:r>
+          </w:p>
+        </w:tc>
+        <w:tc>
+          <w:tcPr>
+            <w:tcW w:type="dxa" w:w="1037"/>
+          </w:tcPr>
+          <w:p>
+            <w:pPr>
+              <w:spacing w:after="0"/>
+              <w:jc w:val="center"/>
+            </w:pPr>
+            <w:r/>
+            <w:r>
+              <w:rPr>
+                <w:sz w:val="19"/>
+              </w:rPr>
+              <w:t>0.09</w:t>
+            </w:r>
+          </w:p>
+        </w:tc>
+        <w:tc>
+          <w:tcPr>
+            <w:tcW w:type="dxa" w:w="1037"/>
+          </w:tcPr>
+          <w:p>
+            <w:pPr>
+              <w:spacing w:after="0"/>
+              <w:jc w:val="center"/>
+            </w:pPr>
+            <w:r/>
+            <w:r>
+              <w:rPr>
+                <w:sz w:val="19"/>
+              </w:rPr>
+              <w:t>0.53</w:t>
+            </w:r>
+          </w:p>
+        </w:tc>
+        <w:tc>
+          <w:tcPr>
+            <w:tcW w:type="dxa" w:w="1037"/>
+          </w:tcPr>
+          <w:p>
+            <w:pPr>
+              <w:spacing w:after="0"/>
+              <w:jc w:val="center"/>
+            </w:pPr>
+            <w:r/>
+            <w:r>
+              <w:rPr>
+                <w:sz w:val="19"/>
+              </w:rPr>
+              <w:t>0.32</w:t>
+            </w:r>
+          </w:p>
+        </w:tc>
+        <w:tc>
+          <w:tcPr>
+            <w:tcW w:type="dxa" w:w="1080"/>
+          </w:tcPr>
+          <w:p>
+            <w:pPr>
+              <w:spacing w:after="0"/>
+              <w:jc w:val="center"/>
+            </w:pPr>
+            <w:r/>
+            <w:r>
+              <w:rPr>
+                <w:sz w:val="19"/>
+              </w:rPr>
+              <w:t>0.26</w:t>
+            </w:r>
+          </w:p>
+        </w:tc>
+        <w:tc>
+          <w:tcPr>
+            <w:tcW w:type="dxa" w:w="979"/>
+          </w:tcPr>
+          <w:p>
+            <w:pPr>
+              <w:spacing w:after="0"/>
+              <w:jc w:val="center"/>
+            </w:pPr>
+            <w:r/>
+            <w:r>
+              <w:rPr>
+                <w:sz w:val="19"/>
+              </w:rPr>
+              <w:t>0.29</w:t>
+            </w:r>
+          </w:p>
+        </w:tc>
+        <w:tc>
+          <w:tcPr>
+            <w:tcW w:type="dxa" w:w="1123"/>
+          </w:tcPr>
+          <w:p>
+            <w:pPr>
+              <w:spacing w:after="0"/>
+              <w:jc w:val="center"/>
+            </w:pPr>
+            <w:r/>
+            <w:r>
+              <w:rPr>
+                <w:sz w:val="19"/>
+              </w:rPr>
+              <w:t>0.00</w:t>
+            </w:r>
+          </w:p>
+        </w:tc>
+      </w:tr>
+      <w:tr>
+        <w:tc>
+          <w:tcPr>
+            <w:tcW w:type="dxa" w:w="2376"/>
+          </w:tcPr>
+          <w:p>
+            <w:pPr>
+              <w:spacing w:after="0"/>
+              <w:jc w:val="left"/>
+            </w:pPr>
+            <w:r/>
+            <w:r>
+              <w:rPr>
+                <w:b/>
+                <w:sz w:val="19"/>
+              </w:rPr>
+              <w:t>Fine-tuned TTS (ours)</w:t>
+            </w:r>
+          </w:p>
+        </w:tc>
+        <w:tc>
+          <w:tcPr>
+            <w:tcW w:type="dxa" w:w="1037"/>
+          </w:tcPr>
+          <w:p>
+            <w:pPr>
+              <w:spacing w:after="0"/>
+              <w:jc w:val="center"/>
+            </w:pPr>
+            <w:r/>
+            <w:r>
+              <w:rPr>
+                <w:sz w:val="19"/>
+              </w:rPr>
+              <w:t>0.27</w:t>
+            </w:r>
+          </w:p>
+        </w:tc>
+        <w:tc>
+          <w:tcPr>
+            <w:tcW w:type="dxa" w:w="1037"/>
+          </w:tcPr>
+          <w:p>
+            <w:pPr>
+              <w:spacing w:after="0"/>
+              <w:jc w:val="center"/>
+            </w:pPr>
+            <w:r/>
+            <w:r>
+              <w:rPr>
+                <w:sz w:val="19"/>
+              </w:rPr>
+              <w:t>0.56</w:t>
+            </w:r>
+          </w:p>
+        </w:tc>
+        <w:tc>
+          <w:tcPr>
+            <w:tcW w:type="dxa" w:w="1037"/>
+          </w:tcPr>
+          <w:p>
+            <w:pPr>
+              <w:spacing w:after="0"/>
+              <w:jc w:val="center"/>
+            </w:pPr>
+            <w:r/>
+            <w:r>
+              <w:rPr>
+                <w:sz w:val="19"/>
+              </w:rPr>
+              <w:t>0.28</w:t>
+            </w:r>
+          </w:p>
+        </w:tc>
+        <w:tc>
+          <w:tcPr>
+            <w:tcW w:type="dxa" w:w="1037"/>
+          </w:tcPr>
+          <w:p>
+            <w:pPr>
+              <w:spacing w:after="0"/>
+              <w:jc w:val="center"/>
+            </w:pPr>
+            <w:r/>
+            <w:r>
+              <w:rPr>
+                <w:sz w:val="19"/>
+              </w:rPr>
+              <w:t>0.86</w:t>
+            </w:r>
+          </w:p>
+        </w:tc>
+        <w:tc>
+          <w:tcPr>
+            <w:tcW w:type="dxa" w:w="1037"/>
+          </w:tcPr>
+          <w:p>
+            <w:pPr>
+              <w:spacing w:after="0"/>
+              <w:jc w:val="center"/>
+            </w:pPr>
+            <w:r/>
+            <w:r>
+              <w:rPr>
+                <w:sz w:val="19"/>
+              </w:rPr>
+              <w:t>0.49</w:t>
+            </w:r>
+          </w:p>
+        </w:tc>
+        <w:tc>
+          <w:tcPr>
+            <w:tcW w:type="dxa" w:w="1080"/>
+          </w:tcPr>
+          <w:p>
+            <w:pPr>
+              <w:spacing w:after="0"/>
+              <w:jc w:val="center"/>
+            </w:pPr>
+            <w:r/>
+            <w:r>
+              <w:rPr>
+                <w:sz w:val="19"/>
+              </w:rPr>
+              <w:t>0.44</w:t>
+            </w:r>
+          </w:p>
+        </w:tc>
+        <w:tc>
+          <w:tcPr>
+            <w:tcW w:type="dxa" w:w="979"/>
+          </w:tcPr>
+          <w:p>
+            <w:pPr>
+              <w:spacing w:after="0"/>
+              <w:jc w:val="center"/>
+            </w:pPr>
+            <w:r/>
+            <w:r>
+              <w:rPr>
+                <w:sz w:val="19"/>
+              </w:rPr>
+              <w:t>0.41</w:t>
+            </w:r>
+          </w:p>
+        </w:tc>
+        <w:tc>
+          <w:tcPr>
+            <w:tcW w:type="dxa" w:w="1123"/>
+          </w:tcPr>
+          <w:p>
+            <w:pPr>
+              <w:spacing w:after="0"/>
+              <w:jc w:val="center"/>
+            </w:pPr>
+            <w:r/>
+            <w:r>
+              <w:rPr>
+                <w:sz w:val="19"/>
+              </w:rPr>
+              <w:t>0.00</w:t>
+            </w:r>
+          </w:p>
+        </w:tc>
+      </w:tr>
+    </w:tbl>
+    <w:p>
+      <w:r>
+        <w:rPr>
+          <w:i/>
+          <w:sz w:val="19"/>
+        </w:rPr>
+        <w:t>Scored by ElevenLabs Scribe. Lower is better throughout.</w:t>
+      </w:r>
+    </w:p>
+    <w:p>
+      <w:pPr>
+        <w:spacing w:before="180" w:after="40"/>
+      </w:pPr>
+      <w:r>
+        <w:rPr>
+          <w:b/>
+          <w:color w:val="1A1A1A"/>
+          <w:sz w:val="26"/>
+        </w:rPr>
+        <w:t>6. Qualitative findings, per model per language</w:t>
+      </w:r>
+    </w:p>
+    <w:tbl>
+      <w:tblPr>
+        <w:tblStyle w:val="TableGrid"/>
+        <w:tblW w:type="auto" w:w="0"/>
+        <w:jc w:val="center"/>
+        <w:tblLook w:firstColumn="1" w:firstRow="1" w:lastColumn="0" w:lastRow="0" w:noHBand="0" w:noVBand="1" w:val="04A0"/>
+      </w:tblPr>
+      <w:tblGrid>
+        <w:gridCol w:w="2045"/>
+        <w:gridCol w:w="2045"/>
+        <w:gridCol w:w="2045"/>
+        <w:gridCol w:w="2045"/>
+        <w:gridCol w:w="2045"/>
       </w:tblGrid>
       <w:tr>
         <w:tc>
@@ -731,7 +1948,7 @@
             <w:r>
               <w:rPr>
                 <w:b/>
-                <w:sz w:val="17"/>
+                <w:sz w:val="19"/>
               </w:rPr>
               <w:t>Model</w:t>
             </w:r>
@@ -743,33 +1960,35 @@
           </w:tcPr>
           <w:p>
             <w:pPr>
+              <w:spacing w:after="0"/>
               <w:jc w:val="center"/>
             </w:pPr>
             <w:r/>
             <w:r>
               <w:rPr>
                 <w:b/>
-                <w:sz w:val="17"/>
+                <w:sz w:val="19"/>
               </w:rPr>
-              <w:t>Critical recall</w:t>
+              <w:t>Best</w:t>
             </w:r>
           </w:p>
         </w:tc>
         <w:tc>
           <w:tcPr>
-            <w:tcW w:type="dxa" w:w="1296"/>
+            <w:tcW w:type="dxa" w:w="1224"/>
           </w:tcPr>
           <w:p>
             <w:pPr>
+              <w:spacing w:after="0"/>
               <w:jc w:val="center"/>
             </w:pPr>
             <w:r/>
             <w:r>
               <w:rPr>
                 <w:b/>
-                <w:sz w:val="17"/>
+                <w:sz w:val="19"/>
               </w:rPr>
-              <w:t>Bench latency</w:t>
+              <w:t>Worst</w:t>
             </w:r>
           </w:p>
         </w:tc>
@@ -779,33 +1998,35 @@
           </w:tcPr>
           <w:p>
             <w:pPr>
+              <w:spacing w:after="0"/>
               <w:jc w:val="center"/>
             </w:pPr>
             <w:r/>
             <w:r>
               <w:rPr>
                 <w:b/>
-                <w:sz w:val="17"/>
+                <w:sz w:val="19"/>
               </w:rPr>
-              <w:t>Live turn wait</w:t>
+              <w:t>Others</w:t>
             </w:r>
           </w:p>
         </w:tc>
         <w:tc>
           <w:tcPr>
-            <w:tcW w:type="dxa" w:w="3744"/>
+            <w:tcW w:type="dxa" w:w="3168"/>
           </w:tcPr>
           <w:p>
             <w:pPr>
+              <w:spacing w:after="0"/>
               <w:jc w:val="center"/>
             </w:pPr>
             <w:r/>
             <w:r>
               <w:rPr>
                 <w:b/>
-                <w:sz w:val="17"/>
+                <w:sz w:val="19"/>
               </w:rPr>
-              <w:t>Verdict</w:t>
+              <w:t>How it fails</w:t>
             </w:r>
           </w:p>
         </w:tc>
@@ -817,13 +2038,14 @@
           </w:tcPr>
           <w:p>
             <w:pPr>
+              <w:spacing w:after="0"/>
               <w:jc w:val="left"/>
             </w:pPr>
             <w:r/>
             <w:r>
               <w:rPr>
                 <w:b/>
-                <w:sz w:val="17"/>
+                <w:sz w:val="19"/>
               </w:rPr>
               <w:t>Intron / Sahara</w:t>
             </w:r>
@@ -835,31 +2057,33 @@
           </w:tcPr>
           <w:p>
             <w:pPr>
+              <w:spacing w:after="0"/>
               <w:jc w:val="center"/>
             </w:pPr>
             <w:r/>
             <w:r>
               <w:rPr>
-                <w:sz w:val="17"/>
+                <w:sz w:val="19"/>
               </w:rPr>
-              <w:t>0.67</w:t>
+              <w:t>Pidgin 0.31</w:t>
             </w:r>
           </w:p>
         </w:tc>
         <w:tc>
           <w:tcPr>
-            <w:tcW w:type="dxa" w:w="1296"/>
+            <w:tcW w:type="dxa" w:w="1224"/>
           </w:tcPr>
           <w:p>
             <w:pPr>
+              <w:spacing w:after="0"/>
               <w:jc w:val="center"/>
             </w:pPr>
             <w:r/>
             <w:r>
               <w:rPr>
-                <w:sz w:val="17"/>
+                <w:sz w:val="19"/>
               </w:rPr>
-              <w:t>29.4 s</w:t>
+              <w:t>Yoruba 0.86</w:t>
             </w:r>
           </w:p>
         </w:tc>
@@ -869,31 +2093,33 @@
           </w:tcPr>
           <w:p>
             <w:pPr>
+              <w:spacing w:after="0"/>
               <w:jc w:val="center"/>
             </w:pPr>
             <w:r/>
             <w:r>
               <w:rPr>
-                <w:sz w:val="17"/>
+                <w:sz w:val="19"/>
               </w:rPr>
-              <w:t>4.1–5.9 s (streaming)</w:t>
+              <w:t>Igbo 0.55, Hausa 0.40</w:t>
             </w:r>
           </w:p>
         </w:tc>
         <w:tc>
           <w:tcPr>
-            <w:tcW w:type="dxa" w:w="3744"/>
+            <w:tcW w:type="dxa" w:w="3168"/>
           </w:tcPr>
           <w:p>
             <w:pPr>
+              <w:spacing w:after="0"/>
               <w:jc w:val="center"/>
             </w:pPr>
             <w:r/>
             <w:r>
               <w:rPr>
-                <w:sz w:val="17"/>
+                <w:sz w:val="19"/>
               </w:rPr>
-              <w:t>Only model that kept both languages; slow</w:t>
+              <w:t>Only model that keeps the English inside a non-English sentence.</w:t>
             </w:r>
           </w:p>
         </w:tc>
@@ -905,13 +2131,14 @@
           </w:tcPr>
           <w:p>
             <w:pPr>
+              <w:spacing w:after="0"/>
               <w:jc w:val="left"/>
             </w:pPr>
             <w:r/>
             <w:r>
               <w:rPr>
                 <w:b/>
-                <w:sz w:val="17"/>
+                <w:sz w:val="19"/>
               </w:rPr>
               <w:t>ElevenLabs Scribe</w:t>
             </w:r>
@@ -923,31 +2150,33 @@
           </w:tcPr>
           <w:p>
             <w:pPr>
+              <w:spacing w:after="0"/>
               <w:jc w:val="center"/>
             </w:pPr>
             <w:r/>
             <w:r>
               <w:rPr>
-                <w:sz w:val="17"/>
+                <w:sz w:val="19"/>
               </w:rPr>
-              <w:t>1.00</w:t>
+              <w:t>Pidgin 0.28</w:t>
             </w:r>
           </w:p>
         </w:tc>
         <w:tc>
           <w:tcPr>
-            <w:tcW w:type="dxa" w:w="1296"/>
+            <w:tcW w:type="dxa" w:w="1224"/>
           </w:tcPr>
           <w:p>
             <w:pPr>
+              <w:spacing w:after="0"/>
               <w:jc w:val="center"/>
             </w:pPr>
             <w:r/>
             <w:r>
               <w:rPr>
-                <w:sz w:val="17"/>
+                <w:sz w:val="19"/>
               </w:rPr>
-              <w:t>2.5 s</w:t>
+              <w:t>Yoruba 0.90</w:t>
             </w:r>
           </w:p>
         </w:tc>
@@ -957,31 +2186,33 @@
           </w:tcPr>
           <w:p>
             <w:pPr>
+              <w:spacing w:after="0"/>
               <w:jc w:val="center"/>
             </w:pPr>
             <w:r/>
             <w:r>
               <w:rPr>
-                <w:sz w:val="17"/>
+                <w:sz w:val="19"/>
               </w:rPr>
-              <w:t>not wired live</w:t>
+              <w:t>Hausa 0.33, Igbo 0.46</w:t>
             </w:r>
           </w:p>
         </w:tc>
         <w:tc>
           <w:tcPr>
-            <w:tcW w:type="dxa" w:w="3744"/>
+            <w:tcW w:type="dxa" w:w="3168"/>
           </w:tcPr>
           <w:p>
             <w:pPr>
+              <w:spacing w:after="0"/>
               <w:jc w:val="center"/>
             </w:pPr>
             <w:r/>
             <w:r>
               <w:rPr>
-                <w:sz w:val="17"/>
+                <w:sz w:val="19"/>
               </w:rPr>
-              <w:t>Most accurate; kept every critical term</w:t>
+              <w:t>Yoruba WER 0.90 on CER 0.38: heard the sounds, spelt them wrongly.</w:t>
             </w:r>
           </w:p>
         </w:tc>
@@ -993,13 +2224,14 @@
           </w:tcPr>
           <w:p>
             <w:pPr>
+              <w:spacing w:after="0"/>
               <w:jc w:val="left"/>
             </w:pPr>
             <w:r/>
             <w:r>
               <w:rPr>
                 <w:b/>
-                <w:sz w:val="17"/>
+                <w:sz w:val="19"/>
               </w:rPr>
               <w:t>Fine-tuned STT (ours)</w:t>
             </w:r>
@@ -1011,31 +2243,33 @@
           </w:tcPr>
           <w:p>
             <w:pPr>
+              <w:spacing w:after="0"/>
               <w:jc w:val="center"/>
             </w:pPr>
             <w:r/>
             <w:r>
               <w:rPr>
-                <w:sz w:val="17"/>
+                <w:sz w:val="19"/>
               </w:rPr>
-              <w:t>0.00</w:t>
+              <w:t>Hausa 0.82</w:t>
             </w:r>
           </w:p>
         </w:tc>
         <w:tc>
           <w:tcPr>
-            <w:tcW w:type="dxa" w:w="1296"/>
+            <w:tcW w:type="dxa" w:w="1224"/>
           </w:tcPr>
           <w:p>
             <w:pPr>
+              <w:spacing w:after="0"/>
               <w:jc w:val="center"/>
             </w:pPr>
             <w:r/>
             <w:r>
               <w:rPr>
-                <w:sz w:val="17"/>
+                <w:sz w:val="19"/>
               </w:rPr>
-              <w:t>2.6 s</w:t>
+              <w:t>Pidgin 1.14</w:t>
             </w:r>
           </w:p>
         </w:tc>
@@ -1045,31 +2279,33 @@
           </w:tcPr>
           <w:p>
             <w:pPr>
+              <w:spacing w:after="0"/>
               <w:jc w:val="center"/>
             </w:pPr>
             <w:r/>
             <w:r>
               <w:rPr>
-                <w:sz w:val="17"/>
+                <w:sz w:val="19"/>
               </w:rPr>
-              <w:t>~2.5 s</w:t>
+              <w:t>Yoruba 0.98, Igbo 0.97</w:t>
             </w:r>
           </w:p>
         </w:tc>
         <w:tc>
           <w:tcPr>
-            <w:tcW w:type="dxa" w:w="3744"/>
+            <w:tcW w:type="dxa" w:w="3168"/>
           </w:tcPr>
           <w:p>
             <w:pPr>
+              <w:spacing w:after="0"/>
               <w:jc w:val="center"/>
             </w:pPr>
             <w:r/>
             <w:r>
               <w:rPr>
-                <w:sz w:val="17"/>
+                <w:sz w:val="19"/>
               </w:rPr>
-              <w:t>Lost every critical term tested</w:t>
+              <w:t>Fluent Yoruba, drops the English, so Pidgin scores worst.</w:t>
             </w:r>
           </w:p>
         </w:tc>
@@ -1081,13 +2317,14 @@
           </w:tcPr>
           <w:p>
             <w:pPr>
+              <w:spacing w:after="0"/>
               <w:jc w:val="left"/>
             </w:pPr>
             <w:r/>
             <w:r>
               <w:rPr>
                 <w:b/>
-                <w:sz w:val="17"/>
+                <w:sz w:val="19"/>
               </w:rPr>
               <w:t>Deepgram nova-2</w:t>
             </w:r>
@@ -1099,31 +2336,33 @@
           </w:tcPr>
           <w:p>
             <w:pPr>
+              <w:spacing w:after="0"/>
               <w:jc w:val="center"/>
             </w:pPr>
             <w:r/>
             <w:r>
               <w:rPr>
-                <w:sz w:val="17"/>
+                <w:sz w:val="19"/>
               </w:rPr>
-              <w:t>0.67</w:t>
+              <w:t>Igbo/Pidgin 0.66</w:t>
             </w:r>
           </w:p>
         </w:tc>
         <w:tc>
           <w:tcPr>
-            <w:tcW w:type="dxa" w:w="1296"/>
+            <w:tcW w:type="dxa" w:w="1224"/>
           </w:tcPr>
           <w:p>
             <w:pPr>
+              <w:spacing w:after="0"/>
               <w:jc w:val="center"/>
             </w:pPr>
             <w:r/>
             <w:r>
               <w:rPr>
-                <w:sz w:val="17"/>
+                <w:sz w:val="19"/>
               </w:rPr>
-              <w:t>2.2 s</w:t>
+              <w:t>Yoruba 0.96</w:t>
             </w:r>
           </w:p>
         </w:tc>
@@ -1133,1196 +2372,33 @@
           </w:tcPr>
           <w:p>
             <w:pPr>
+              <w:spacing w:after="0"/>
               <w:jc w:val="center"/>
             </w:pPr>
             <w:r/>
             <w:r>
               <w:rPr>
-                <w:sz w:val="17"/>
+                <w:sz w:val="19"/>
               </w:rPr>
-              <w:t>~0.3 s</w:t>
+              <w:t>Hausa 0.89</w:t>
             </w:r>
           </w:p>
         </w:tc>
         <w:tc>
           <w:tcPr>
-            <w:tcW w:type="dxa" w:w="3744"/>
+            <w:tcW w:type="dxa" w:w="3168"/>
           </w:tcPr>
           <w:p>
             <w:pPr>
+              <w:spacing w:after="0"/>
               <w:jc w:val="center"/>
             </w:pPr>
             <w:r/>
             <w:r>
               <w:rPr>
-                <w:sz w:val="17"/>
+                <w:sz w:val="19"/>
               </w:rPr>
-              <w:t>Fast, but deaf to three of the four</w:t>
-            </w:r>
-          </w:p>
-        </w:tc>
-      </w:tr>
-    </w:tbl>
-    <w:p>
-      <w:r>
-        <w:rPr>
-          <w:i/>
-          <w:sz w:val="16"/>
-        </w:rPr>
-        <w:t>Critical recall is measured only on clips whose reference contains a decision-carrying term (3 of 16), so treat it as directional, not precise. Benchmark latency includes the harness's rate-limit pacing and cold-start waits; the live column is measured on the deployed pipeline. Intron's benchmark figure of 29.5 s is almost entirely warm-up and pacing, not inference.</w:t>
-      </w:r>
-    </w:p>
-    <w:p>
-      <w:pPr>
-        <w:spacing w:before="160" w:after="60"/>
-      </w:pPr>
-      <w:r>
-        <w:rPr>
-          <w:b/>
-          <w:color w:val="1A1A1A"/>
-          <w:sz w:val="24"/>
-        </w:rPr>
-        <w:t>5. TTS results — round-trip WER per language</w:t>
-      </w:r>
-    </w:p>
-    <w:tbl>
-      <w:tblPr>
-        <w:tblStyle w:val="TableGrid"/>
-        <w:tblW w:type="auto" w:w="0"/>
-        <w:jc w:val="center"/>
-        <w:tblLook w:firstColumn="1" w:firstRow="1" w:lastColumn="0" w:lastRow="0" w:noHBand="0" w:noVBand="1" w:val="04A0"/>
-      </w:tblPr>
-      <w:tblGrid>
-        <w:gridCol w:w="1168"/>
-        <w:gridCol w:w="1168"/>
-        <w:gridCol w:w="1168"/>
-        <w:gridCol w:w="1168"/>
-        <w:gridCol w:w="1168"/>
-        <w:gridCol w:w="1168"/>
-        <w:gridCol w:w="1168"/>
-        <w:gridCol w:w="1168"/>
-        <w:gridCol w:w="1168"/>
-      </w:tblGrid>
-      <w:tr>
-        <w:tc>
-          <w:tcPr>
-            <w:tcW w:type="dxa" w:w="2376"/>
-          </w:tcPr>
-          <w:p>
-            <w:pPr>
-              <w:spacing w:after="0"/>
-              <w:jc w:val="left"/>
-            </w:pPr>
-            <w:r/>
-            <w:r>
-              <w:rPr>
-                <w:b/>
-                <w:sz w:val="17"/>
-              </w:rPr>
-              <w:t>Model</w:t>
-            </w:r>
-          </w:p>
-        </w:tc>
-        <w:tc>
-          <w:tcPr>
-            <w:tcW w:type="dxa" w:w="1037"/>
-          </w:tcPr>
-          <w:p>
-            <w:pPr>
-              <w:jc w:val="center"/>
-            </w:pPr>
-            <w:r/>
-            <w:r>
-              <w:rPr>
-                <w:b/>
-                <w:sz w:val="17"/>
-              </w:rPr>
-              <w:t>Hausa</w:t>
-            </w:r>
-          </w:p>
-        </w:tc>
-        <w:tc>
-          <w:tcPr>
-            <w:tcW w:type="dxa" w:w="1037"/>
-          </w:tcPr>
-          <w:p>
-            <w:pPr>
-              <w:jc w:val="center"/>
-            </w:pPr>
-            <w:r/>
-            <w:r>
-              <w:rPr>
-                <w:b/>
-                <w:sz w:val="17"/>
-              </w:rPr>
-              <w:t>Igbo</w:t>
-            </w:r>
-          </w:p>
-        </w:tc>
-        <w:tc>
-          <w:tcPr>
-            <w:tcW w:type="dxa" w:w="1037"/>
-          </w:tcPr>
-          <w:p>
-            <w:pPr>
-              <w:jc w:val="center"/>
-            </w:pPr>
-            <w:r/>
-            <w:r>
-              <w:rPr>
-                <w:b/>
-                <w:sz w:val="17"/>
-              </w:rPr>
-              <w:t>Pidgin</w:t>
-            </w:r>
-          </w:p>
-        </w:tc>
-        <w:tc>
-          <w:tcPr>
-            <w:tcW w:type="dxa" w:w="1037"/>
-          </w:tcPr>
-          <w:p>
-            <w:pPr>
-              <w:jc w:val="center"/>
-            </w:pPr>
-            <w:r/>
-            <w:r>
-              <w:rPr>
-                <w:b/>
-                <w:sz w:val="17"/>
-              </w:rPr>
-              <w:t>Yoruba</w:t>
-            </w:r>
-          </w:p>
-        </w:tc>
-        <w:tc>
-          <w:tcPr>
-            <w:tcW w:type="dxa" w:w="1037"/>
-          </w:tcPr>
-          <w:p>
-            <w:pPr>
-              <w:jc w:val="center"/>
-            </w:pPr>
-            <w:r/>
-            <w:r>
-              <w:rPr>
-                <w:b/>
-                <w:sz w:val="17"/>
-              </w:rPr>
-              <w:t>WER</w:t>
-            </w:r>
-          </w:p>
-        </w:tc>
-        <w:tc>
-          <w:tcPr>
-            <w:tcW w:type="dxa" w:w="1080"/>
-          </w:tcPr>
-          <w:p>
-            <w:pPr>
-              <w:jc w:val="center"/>
-            </w:pPr>
-            <w:r/>
-            <w:r>
-              <w:rPr>
-                <w:b/>
-                <w:sz w:val="17"/>
-              </w:rPr>
-              <w:t>Halluc.</w:t>
-            </w:r>
-          </w:p>
-        </w:tc>
-        <w:tc>
-          <w:tcPr>
-            <w:tcW w:type="dxa" w:w="979"/>
-          </w:tcPr>
-          <w:p>
-            <w:pPr>
-              <w:jc w:val="center"/>
-            </w:pPr>
-            <w:r/>
-            <w:r>
-              <w:rPr>
-                <w:b/>
-                <w:sz w:val="17"/>
-              </w:rPr>
-              <w:t>Loss</w:t>
-            </w:r>
-          </w:p>
-        </w:tc>
-        <w:tc>
-          <w:tcPr>
-            <w:tcW w:type="dxa" w:w="1123"/>
-          </w:tcPr>
-          <w:p>
-            <w:pPr>
-              <w:jc w:val="center"/>
-            </w:pPr>
-            <w:r/>
-            <w:r>
-              <w:rPr>
-                <w:b/>
-                <w:sz w:val="17"/>
-              </w:rPr>
-              <w:t>Seg lost</w:t>
-            </w:r>
-          </w:p>
-        </w:tc>
-      </w:tr>
-      <w:tr>
-        <w:tc>
-          <w:tcPr>
-            <w:tcW w:type="dxa" w:w="2376"/>
-          </w:tcPr>
-          <w:p>
-            <w:pPr>
-              <w:jc w:val="left"/>
-            </w:pPr>
-            <w:r/>
-            <w:r>
-              <w:rPr>
-                <w:b/>
-                <w:sz w:val="17"/>
-              </w:rPr>
-              <w:t>ElevenLabs multiling. v2</w:t>
-            </w:r>
-          </w:p>
-        </w:tc>
-        <w:tc>
-          <w:tcPr>
-            <w:tcW w:type="dxa" w:w="1037"/>
-          </w:tcPr>
-          <w:p>
-            <w:pPr>
-              <w:jc w:val="center"/>
-            </w:pPr>
-            <w:r/>
-            <w:r>
-              <w:rPr>
-                <w:sz w:val="17"/>
-              </w:rPr>
-              <w:t>0.30</w:t>
-            </w:r>
-          </w:p>
-        </w:tc>
-        <w:tc>
-          <w:tcPr>
-            <w:tcW w:type="dxa" w:w="1037"/>
-          </w:tcPr>
-          <w:p>
-            <w:pPr>
-              <w:jc w:val="center"/>
-            </w:pPr>
-            <w:r/>
-            <w:r>
-              <w:rPr>
-                <w:sz w:val="17"/>
-              </w:rPr>
-              <w:t>0.37</w:t>
-            </w:r>
-          </w:p>
-        </w:tc>
-        <w:tc>
-          <w:tcPr>
-            <w:tcW w:type="dxa" w:w="1037"/>
-          </w:tcPr>
-          <w:p>
-            <w:pPr>
-              <w:jc w:val="center"/>
-            </w:pPr>
-            <w:r/>
-            <w:r>
-              <w:rPr>
-                <w:sz w:val="17"/>
-              </w:rPr>
-              <w:t>0.09</w:t>
-            </w:r>
-          </w:p>
-        </w:tc>
-        <w:tc>
-          <w:tcPr>
-            <w:tcW w:type="dxa" w:w="1037"/>
-          </w:tcPr>
-          <w:p>
-            <w:pPr>
-              <w:jc w:val="center"/>
-            </w:pPr>
-            <w:r/>
-            <w:r>
-              <w:rPr>
-                <w:sz w:val="17"/>
-              </w:rPr>
-              <w:t>0.53</w:t>
-            </w:r>
-          </w:p>
-        </w:tc>
-        <w:tc>
-          <w:tcPr>
-            <w:tcW w:type="dxa" w:w="1037"/>
-          </w:tcPr>
-          <w:p>
-            <w:pPr>
-              <w:jc w:val="center"/>
-            </w:pPr>
-            <w:r/>
-            <w:r>
-              <w:rPr>
-                <w:sz w:val="17"/>
-              </w:rPr>
-              <w:t>0.32</w:t>
-            </w:r>
-          </w:p>
-        </w:tc>
-        <w:tc>
-          <w:tcPr>
-            <w:tcW w:type="dxa" w:w="1080"/>
-          </w:tcPr>
-          <w:p>
-            <w:pPr>
-              <w:jc w:val="center"/>
-            </w:pPr>
-            <w:r/>
-            <w:r>
-              <w:rPr>
-                <w:sz w:val="17"/>
-              </w:rPr>
-              <w:t>0.26</w:t>
-            </w:r>
-          </w:p>
-        </w:tc>
-        <w:tc>
-          <w:tcPr>
-            <w:tcW w:type="dxa" w:w="979"/>
-          </w:tcPr>
-          <w:p>
-            <w:pPr>
-              <w:jc w:val="center"/>
-            </w:pPr>
-            <w:r/>
-            <w:r>
-              <w:rPr>
-                <w:sz w:val="17"/>
-              </w:rPr>
-              <w:t>0.29</w:t>
-            </w:r>
-          </w:p>
-        </w:tc>
-        <w:tc>
-          <w:tcPr>
-            <w:tcW w:type="dxa" w:w="1123"/>
-          </w:tcPr>
-          <w:p>
-            <w:pPr>
-              <w:jc w:val="center"/>
-            </w:pPr>
-            <w:r/>
-            <w:r>
-              <w:rPr>
-                <w:sz w:val="17"/>
-              </w:rPr>
-              <w:t>0.00</w:t>
-            </w:r>
-          </w:p>
-        </w:tc>
-      </w:tr>
-      <w:tr>
-        <w:tc>
-          <w:tcPr>
-            <w:tcW w:type="dxa" w:w="2376"/>
-          </w:tcPr>
-          <w:p>
-            <w:pPr>
-              <w:jc w:val="left"/>
-            </w:pPr>
-            <w:r/>
-            <w:r>
-              <w:rPr>
-                <w:b/>
-                <w:sz w:val="17"/>
-              </w:rPr>
-              <w:t>Fine-tuned TTS (ours)</w:t>
-            </w:r>
-          </w:p>
-        </w:tc>
-        <w:tc>
-          <w:tcPr>
-            <w:tcW w:type="dxa" w:w="1037"/>
-          </w:tcPr>
-          <w:p>
-            <w:pPr>
-              <w:jc w:val="center"/>
-            </w:pPr>
-            <w:r/>
-            <w:r>
-              <w:rPr>
-                <w:sz w:val="17"/>
-              </w:rPr>
-              <w:t>0.27</w:t>
-            </w:r>
-          </w:p>
-        </w:tc>
-        <w:tc>
-          <w:tcPr>
-            <w:tcW w:type="dxa" w:w="1037"/>
-          </w:tcPr>
-          <w:p>
-            <w:pPr>
-              <w:jc w:val="center"/>
-            </w:pPr>
-            <w:r/>
-            <w:r>
-              <w:rPr>
-                <w:sz w:val="17"/>
-              </w:rPr>
-              <w:t>0.56</w:t>
-            </w:r>
-          </w:p>
-        </w:tc>
-        <w:tc>
-          <w:tcPr>
-            <w:tcW w:type="dxa" w:w="1037"/>
-          </w:tcPr>
-          <w:p>
-            <w:pPr>
-              <w:jc w:val="center"/>
-            </w:pPr>
-            <w:r/>
-            <w:r>
-              <w:rPr>
-                <w:sz w:val="17"/>
-              </w:rPr>
-              <w:t>0.28</w:t>
-            </w:r>
-          </w:p>
-        </w:tc>
-        <w:tc>
-          <w:tcPr>
-            <w:tcW w:type="dxa" w:w="1037"/>
-          </w:tcPr>
-          <w:p>
-            <w:pPr>
-              <w:jc w:val="center"/>
-            </w:pPr>
-            <w:r/>
-            <w:r>
-              <w:rPr>
-                <w:sz w:val="17"/>
-              </w:rPr>
-              <w:t>0.86</w:t>
-            </w:r>
-          </w:p>
-        </w:tc>
-        <w:tc>
-          <w:tcPr>
-            <w:tcW w:type="dxa" w:w="1037"/>
-          </w:tcPr>
-          <w:p>
-            <w:pPr>
-              <w:jc w:val="center"/>
-            </w:pPr>
-            <w:r/>
-            <w:r>
-              <w:rPr>
-                <w:sz w:val="17"/>
-              </w:rPr>
-              <w:t>0.49</w:t>
-            </w:r>
-          </w:p>
-        </w:tc>
-        <w:tc>
-          <w:tcPr>
-            <w:tcW w:type="dxa" w:w="1080"/>
-          </w:tcPr>
-          <w:p>
-            <w:pPr>
-              <w:jc w:val="center"/>
-            </w:pPr>
-            <w:r/>
-            <w:r>
-              <w:rPr>
-                <w:sz w:val="17"/>
-              </w:rPr>
-              <w:t>0.44</w:t>
-            </w:r>
-          </w:p>
-        </w:tc>
-        <w:tc>
-          <w:tcPr>
-            <w:tcW w:type="dxa" w:w="979"/>
-          </w:tcPr>
-          <w:p>
-            <w:pPr>
-              <w:jc w:val="center"/>
-            </w:pPr>
-            <w:r/>
-            <w:r>
-              <w:rPr>
-                <w:sz w:val="17"/>
-              </w:rPr>
-              <w:t>0.41</w:t>
-            </w:r>
-          </w:p>
-        </w:tc>
-        <w:tc>
-          <w:tcPr>
-            <w:tcW w:type="dxa" w:w="1123"/>
-          </w:tcPr>
-          <w:p>
-            <w:pPr>
-              <w:jc w:val="center"/>
-            </w:pPr>
-            <w:r/>
-            <w:r>
-              <w:rPr>
-                <w:sz w:val="17"/>
-              </w:rPr>
-              <w:t>0.00</w:t>
-            </w:r>
-          </w:p>
-        </w:tc>
-      </w:tr>
-      <w:tr>
-        <w:tc>
-          <w:tcPr>
-            <w:tcW w:type="dxa" w:w="2376"/>
-          </w:tcPr>
-          <w:p>
-            <w:pPr>
-              <w:jc w:val="left"/>
-            </w:pPr>
-            <w:r/>
-            <w:r>
-              <w:rPr>
-                <w:b/>
-                <w:sz w:val="17"/>
-              </w:rPr>
-              <w:t>Intron / Sahara</w:t>
-            </w:r>
-          </w:p>
-        </w:tc>
-        <w:tc>
-          <w:tcPr>
-            <w:tcW w:type="dxa" w:w="1037"/>
-          </w:tcPr>
-          <w:p>
-            <w:pPr>
-              <w:jc w:val="center"/>
-            </w:pPr>
-            <w:r/>
-            <w:r>
-              <w:rPr>
-                <w:sz w:val="17"/>
-              </w:rPr>
-              <w:t>0.72</w:t>
-            </w:r>
-          </w:p>
-        </w:tc>
-        <w:tc>
-          <w:tcPr>
-            <w:tcW w:type="dxa" w:w="1037"/>
-          </w:tcPr>
-          <w:p>
-            <w:pPr>
-              <w:jc w:val="center"/>
-            </w:pPr>
-            <w:r/>
-            <w:r>
-              <w:rPr>
-                <w:sz w:val="17"/>
-              </w:rPr>
-              <w:t>0.33</w:t>
-            </w:r>
-          </w:p>
-        </w:tc>
-        <w:tc>
-          <w:tcPr>
-            <w:tcW w:type="dxa" w:w="1037"/>
-          </w:tcPr>
-          <w:p>
-            <w:pPr>
-              <w:jc w:val="center"/>
-            </w:pPr>
-            <w:r/>
-            <w:r>
-              <w:rPr>
-                <w:sz w:val="17"/>
-              </w:rPr>
-              <w:t>0.46</w:t>
-            </w:r>
-          </w:p>
-        </w:tc>
-        <w:tc>
-          <w:tcPr>
-            <w:tcW w:type="dxa" w:w="1037"/>
-          </w:tcPr>
-          <w:p>
-            <w:pPr>
-              <w:jc w:val="center"/>
-            </w:pPr>
-            <w:r/>
-            <w:r>
-              <w:rPr>
-                <w:sz w:val="17"/>
-              </w:rPr>
-              <w:t>0.93</w:t>
-            </w:r>
-          </w:p>
-        </w:tc>
-        <w:tc>
-          <w:tcPr>
-            <w:tcW w:type="dxa" w:w="1037"/>
-          </w:tcPr>
-          <w:p>
-            <w:pPr>
-              <w:jc w:val="center"/>
-            </w:pPr>
-            <w:r/>
-            <w:r>
-              <w:rPr>
-                <w:sz w:val="17"/>
-              </w:rPr>
-              <w:t>0.61</w:t>
-            </w:r>
-          </w:p>
-        </w:tc>
-        <w:tc>
-          <w:tcPr>
-            <w:tcW w:type="dxa" w:w="1080"/>
-          </w:tcPr>
-          <w:p>
-            <w:pPr>
-              <w:jc w:val="center"/>
-            </w:pPr>
-            <w:r/>
-            <w:r>
-              <w:rPr>
-                <w:sz w:val="17"/>
-              </w:rPr>
-              <w:t>0.23</w:t>
-            </w:r>
-          </w:p>
-        </w:tc>
-        <w:tc>
-          <w:tcPr>
-            <w:tcW w:type="dxa" w:w="979"/>
-          </w:tcPr>
-          <w:p>
-            <w:pPr>
-              <w:jc w:val="center"/>
-            </w:pPr>
-            <w:r/>
-            <w:r>
-              <w:rPr>
-                <w:sz w:val="17"/>
-              </w:rPr>
-              <w:t>0.59</w:t>
-            </w:r>
-          </w:p>
-        </w:tc>
-        <w:tc>
-          <w:tcPr>
-            <w:tcW w:type="dxa" w:w="1123"/>
-          </w:tcPr>
-          <w:p>
-            <w:pPr>
-              <w:jc w:val="center"/>
-            </w:pPr>
-            <w:r/>
-            <w:r>
-              <w:rPr>
-                <w:sz w:val="17"/>
-              </w:rPr>
-              <w:t>0.12</w:t>
-            </w:r>
-          </w:p>
-        </w:tc>
-      </w:tr>
-    </w:tbl>
-    <w:p>
-      <w:r>
-        <w:rPr>
-          <w:i/>
-          <w:sz w:val="16"/>
-        </w:rPr>
-        <w:t>Scored by ElevenLabs Scribe. Lower is better throughout.</w:t>
-      </w:r>
-    </w:p>
-    <w:p>
-      <w:pPr>
-        <w:spacing w:before="160" w:after="60"/>
-      </w:pPr>
-      <w:r>
-        <w:rPr>
-          <w:b/>
-          <w:color w:val="1A1A1A"/>
-          <w:sz w:val="24"/>
-        </w:rPr>
-        <w:t>6. Qualitative findings, per model per language</w:t>
-      </w:r>
-    </w:p>
-    <w:p>
-      <w:r>
-        <w:rPr>
-          <w:i/>
-          <w:sz w:val="16"/>
-        </w:rPr>
-        <w:t>Best and worst language for each model, with what the numbers mean. Yoruba was hardest and Pidgin easiest for every ASR model tested, so the interesting differences are in how each one fails.</w:t>
-      </w:r>
-    </w:p>
-    <w:tbl>
-      <w:tblPr>
-        <w:tblStyle w:val="TableGrid"/>
-        <w:tblW w:type="auto" w:w="0"/>
-        <w:jc w:val="center"/>
-        <w:tblLook w:firstColumn="1" w:firstRow="1" w:lastColumn="0" w:lastRow="0" w:noHBand="0" w:noVBand="1" w:val="04A0"/>
-      </w:tblPr>
-      <w:tblGrid>
-        <w:gridCol w:w="2102"/>
-        <w:gridCol w:w="2102"/>
-        <w:gridCol w:w="2102"/>
-        <w:gridCol w:w="2102"/>
-        <w:gridCol w:w="2102"/>
-      </w:tblGrid>
-      <w:tr>
-        <w:tc>
-          <w:tcPr>
-            <w:tcW w:type="dxa" w:w="1656"/>
-          </w:tcPr>
-          <w:p>
-            <w:pPr>
-              <w:spacing w:after="0"/>
-              <w:jc w:val="left"/>
-            </w:pPr>
-            <w:r/>
-            <w:r>
-              <w:rPr>
-                <w:b/>
-                <w:sz w:val="17"/>
-              </w:rPr>
-              <w:t>Model</w:t>
-            </w:r>
-          </w:p>
-        </w:tc>
-        <w:tc>
-          <w:tcPr>
-            <w:tcW w:type="dxa" w:w="1800"/>
-          </w:tcPr>
-          <w:p>
-            <w:pPr>
-              <w:jc w:val="center"/>
-            </w:pPr>
-            <w:r/>
-            <w:r>
-              <w:rPr>
-                <w:b/>
-                <w:sz w:val="17"/>
-              </w:rPr>
-              <w:t>Strongest</w:t>
-            </w:r>
-          </w:p>
-        </w:tc>
-        <w:tc>
-          <w:tcPr>
-            <w:tcW w:type="dxa" w:w="1368"/>
-          </w:tcPr>
-          <w:p>
-            <w:pPr>
-              <w:jc w:val="center"/>
-            </w:pPr>
-            <w:r/>
-            <w:r>
-              <w:rPr>
-                <w:b/>
-                <w:sz w:val="17"/>
-              </w:rPr>
-              <w:t>Weakest</w:t>
-            </w:r>
-          </w:p>
-        </w:tc>
-        <w:tc>
-          <w:tcPr>
-            <w:tcW w:type="dxa" w:w="1368"/>
-          </w:tcPr>
-          <w:p>
-            <w:pPr>
-              <w:jc w:val="center"/>
-            </w:pPr>
-            <w:r/>
-            <w:r>
-              <w:rPr>
-                <w:b/>
-                <w:sz w:val="17"/>
-              </w:rPr>
-              <w:t>Others</w:t>
-            </w:r>
-          </w:p>
-        </w:tc>
-        <w:tc>
-          <w:tcPr>
-            <w:tcW w:type="dxa" w:w="4320"/>
-          </w:tcPr>
-          <w:p>
-            <w:pPr>
-              <w:jc w:val="center"/>
-            </w:pPr>
-            <w:r/>
-            <w:r>
-              <w:rPr>
-                <w:b/>
-                <w:sz w:val="17"/>
-              </w:rPr>
-              <w:t>What the failure looks like</w:t>
-            </w:r>
-          </w:p>
-        </w:tc>
-      </w:tr>
-      <w:tr>
-        <w:tc>
-          <w:tcPr>
-            <w:tcW w:type="dxa" w:w="1656"/>
-          </w:tcPr>
-          <w:p>
-            <w:pPr>
-              <w:jc w:val="left"/>
-            </w:pPr>
-            <w:r/>
-            <w:r>
-              <w:rPr>
-                <w:b/>
-                <w:sz w:val="17"/>
-              </w:rPr>
-              <w:t>Intron / Sahara</w:t>
-            </w:r>
-          </w:p>
-        </w:tc>
-        <w:tc>
-          <w:tcPr>
-            <w:tcW w:type="dxa" w:w="1800"/>
-          </w:tcPr>
-          <w:p>
-            <w:pPr>
-              <w:jc w:val="center"/>
-            </w:pPr>
-            <w:r/>
-            <w:r>
-              <w:rPr>
-                <w:sz w:val="17"/>
-              </w:rPr>
-              <w:t>Pidgin 0.31/0.17 - best CER of any model on any language</w:t>
-            </w:r>
-          </w:p>
-        </w:tc>
-        <w:tc>
-          <w:tcPr>
-            <w:tcW w:type="dxa" w:w="1368"/>
-          </w:tcPr>
-          <w:p>
-            <w:pPr>
-              <w:jc w:val="center"/>
-            </w:pPr>
-            <w:r/>
-            <w:r>
-              <w:rPr>
-                <w:sz w:val="17"/>
-              </w:rPr>
-              <w:t>Yoruba 0.86</w:t>
-            </w:r>
-          </w:p>
-        </w:tc>
-        <w:tc>
-          <w:tcPr>
-            <w:tcW w:type="dxa" w:w="1368"/>
-          </w:tcPr>
-          <w:p>
-            <w:pPr>
-              <w:jc w:val="center"/>
-            </w:pPr>
-            <w:r/>
-            <w:r>
-              <w:rPr>
-                <w:sz w:val="17"/>
-              </w:rPr>
-              <w:t>Igbo 0.55, Hausa 0.40</w:t>
-            </w:r>
-          </w:p>
-        </w:tc>
-        <w:tc>
-          <w:tcPr>
-            <w:tcW w:type="dxa" w:w="4320"/>
-          </w:tcPr>
-          <w:p>
-            <w:pPr>
-              <w:jc w:val="center"/>
-            </w:pPr>
-            <w:r/>
-            <w:r>
-              <w:rPr>
-                <w:sz w:val="17"/>
-              </w:rPr>
-              <w:t>The only model that keeps the English inside a non-English sentence. One reference ended “...ni o da o you need to base your” and it returned “...ni ò dá o need to base your”. Pair code matters: ‘yo’ is Yoruba-English, ‘en’ is monolingual and discards the Yoruba silently.</w:t>
-            </w:r>
-          </w:p>
-        </w:tc>
-      </w:tr>
-      <w:tr>
-        <w:tc>
-          <w:tcPr>
-            <w:tcW w:type="dxa" w:w="1656"/>
-          </w:tcPr>
-          <w:p>
-            <w:pPr>
-              <w:jc w:val="left"/>
-            </w:pPr>
-            <w:r/>
-            <w:r>
-              <w:rPr>
-                <w:b/>
-                <w:sz w:val="17"/>
-              </w:rPr>
-              <w:t>ElevenLabs Scribe</w:t>
-            </w:r>
-          </w:p>
-        </w:tc>
-        <w:tc>
-          <w:tcPr>
-            <w:tcW w:type="dxa" w:w="1800"/>
-          </w:tcPr>
-          <w:p>
-            <w:pPr>
-              <w:jc w:val="center"/>
-            </w:pPr>
-            <w:r/>
-            <w:r>
-              <w:rPr>
-                <w:sz w:val="17"/>
-              </w:rPr>
-              <w:t>Pidgin 0.28, Hausa 0.33/0.11</w:t>
-            </w:r>
-          </w:p>
-        </w:tc>
-        <w:tc>
-          <w:tcPr>
-            <w:tcW w:type="dxa" w:w="1368"/>
-          </w:tcPr>
-          <w:p>
-            <w:pPr>
-              <w:jc w:val="center"/>
-            </w:pPr>
-            <w:r/>
-            <w:r>
-              <w:rPr>
-                <w:sz w:val="17"/>
-              </w:rPr>
-              <w:t>Yoruba 0.90</w:t>
-            </w:r>
-          </w:p>
-        </w:tc>
-        <w:tc>
-          <w:tcPr>
-            <w:tcW w:type="dxa" w:w="1368"/>
-          </w:tcPr>
-          <w:p>
-            <w:pPr>
-              <w:jc w:val="center"/>
-            </w:pPr>
-            <w:r/>
-            <w:r>
-              <w:rPr>
-                <w:sz w:val="17"/>
-              </w:rPr>
-              <w:t>Igbo 0.46</w:t>
-            </w:r>
-          </w:p>
-        </w:tc>
-        <w:tc>
-          <w:tcPr>
-            <w:tcW w:type="dxa" w:w="4320"/>
-          </w:tcPr>
-          <w:p>
-            <w:pPr>
-              <w:jc w:val="center"/>
-            </w:pPr>
-            <w:r/>
-            <w:r>
-              <w:rPr>
-                <w:sz w:val="17"/>
-              </w:rPr>
-              <w:t>Most accurate overall and the only ASR that kept every critical term. Its Yoruba WER of 0.90 against a CER of 0.38 is a model hearing the sounds and spelling them wrongly, not missing them - recoverable, unlike deletion.</w:t>
-            </w:r>
-          </w:p>
-        </w:tc>
-      </w:tr>
-      <w:tr>
-        <w:tc>
-          <w:tcPr>
-            <w:tcW w:type="dxa" w:w="1656"/>
-          </w:tcPr>
-          <w:p>
-            <w:pPr>
-              <w:jc w:val="left"/>
-            </w:pPr>
-            <w:r/>
-            <w:r>
-              <w:rPr>
-                <w:b/>
-                <w:sz w:val="17"/>
-              </w:rPr>
-              <w:t>Fine-tuned STT (ours)</w:t>
-            </w:r>
-          </w:p>
-        </w:tc>
-        <w:tc>
-          <w:tcPr>
-            <w:tcW w:type="dxa" w:w="1800"/>
-          </w:tcPr>
-          <w:p>
-            <w:pPr>
-              <w:jc w:val="center"/>
-            </w:pPr>
-            <w:r/>
-            <w:r>
-              <w:rPr>
-                <w:sz w:val="17"/>
-              </w:rPr>
-              <w:t>Hausa 0.82 - its least bad</w:t>
-            </w:r>
-          </w:p>
-        </w:tc>
-        <w:tc>
-          <w:tcPr>
-            <w:tcW w:type="dxa" w:w="1368"/>
-          </w:tcPr>
-          <w:p>
-            <w:pPr>
-              <w:jc w:val="center"/>
-            </w:pPr>
-            <w:r/>
-            <w:r>
-              <w:rPr>
-                <w:sz w:val="17"/>
-              </w:rPr>
-              <w:t>Pidgin 1.14 - worse than transcribing nothing</w:t>
-            </w:r>
-          </w:p>
-        </w:tc>
-        <w:tc>
-          <w:tcPr>
-            <w:tcW w:type="dxa" w:w="1368"/>
-          </w:tcPr>
-          <w:p>
-            <w:pPr>
-              <w:jc w:val="center"/>
-            </w:pPr>
-            <w:r/>
-            <w:r>
-              <w:rPr>
-                <w:sz w:val="17"/>
-              </w:rPr>
-              <w:t>Yoruba 0.98, Igbo 0.97</w:t>
-            </w:r>
-          </w:p>
-        </w:tc>
-        <w:tc>
-          <w:tcPr>
-            <w:tcW w:type="dxa" w:w="4320"/>
-          </w:tcPr>
-          <w:p>
-            <w:pPr>
-              <w:jc w:val="center"/>
-            </w:pPr>
-            <w:r/>
-            <w:r>
-              <w:rPr>
-                <w:sz w:val="17"/>
-              </w:rPr>
-              <w:t>Transcribes Yoruba fluently but drops the English clauses out of mixed utterances, which is why Pidgin scores worst: Pidgin is mostly English. Lost every critical term measured, and hallucinated fluent sentences from silence in live testing - unsafe on an open microphone.</w:t>
-            </w:r>
-          </w:p>
-        </w:tc>
-      </w:tr>
-      <w:tr>
-        <w:tc>
-          <w:tcPr>
-            <w:tcW w:type="dxa" w:w="1656"/>
-          </w:tcPr>
-          <w:p>
-            <w:pPr>
-              <w:jc w:val="left"/>
-            </w:pPr>
-            <w:r/>
-            <w:r>
-              <w:rPr>
-                <w:b/>
-                <w:sz w:val="17"/>
-              </w:rPr>
-              <w:t>Deepgram nova-2</w:t>
-            </w:r>
-          </w:p>
-        </w:tc>
-        <w:tc>
-          <w:tcPr>
-            <w:tcW w:type="dxa" w:w="1800"/>
-          </w:tcPr>
-          <w:p>
-            <w:pPr>
-              <w:jc w:val="center"/>
-            </w:pPr>
-            <w:r/>
-            <w:r>
-              <w:rPr>
-                <w:sz w:val="17"/>
-              </w:rPr>
-              <w:t>Igbo and Pidgin 0.66</w:t>
-            </w:r>
-          </w:p>
-        </w:tc>
-        <w:tc>
-          <w:tcPr>
-            <w:tcW w:type="dxa" w:w="1368"/>
-          </w:tcPr>
-          <w:p>
-            <w:pPr>
-              <w:jc w:val="center"/>
-            </w:pPr>
-            <w:r/>
-            <w:r>
-              <w:rPr>
-                <w:sz w:val="17"/>
-              </w:rPr>
-              <w:t>Yoruba 0.96/0.96</w:t>
-            </w:r>
-          </w:p>
-        </w:tc>
-        <w:tc>
-          <w:tcPr>
-            <w:tcW w:type="dxa" w:w="1368"/>
-          </w:tcPr>
-          <w:p>
-            <w:pPr>
-              <w:jc w:val="center"/>
-            </w:pPr>
-            <w:r/>
-            <w:r>
-              <w:rPr>
-                <w:sz w:val="17"/>
-              </w:rPr>
-              <w:t>Hausa 0.89/0.83</w:t>
-            </w:r>
-          </w:p>
-        </w:tc>
-        <w:tc>
-          <w:tcPr>
-            <w:tcW w:type="dxa" w:w="4320"/>
-          </w:tcPr>
-          <w:p>
-            <w:pPr>
-              <w:jc w:val="center"/>
-            </w:pPr>
-            <w:r/>
-            <w:r>
-              <w:rPr>
-                <w:sz w:val="17"/>
-              </w:rPr>
-              <w:t>Fast and clean on English, effectively deaf here. WER and CER failing together means the audio was not recognised at all rather than mis-spelt. It is the baseline that shows why a code-switched model is needed.</w:t>
+              <w:t>WER and CER fail together: not recognised at all, not mis-spelt.</w:t>
             </w:r>
           </w:p>
         </w:tc>
@@ -2332,20 +2408,29 @@
       <w:r>
         <w:rPr>
           <w:i w:val="0"/>
-          <w:sz w:val="18"/>
+          <w:sz w:val="22"/>
         </w:rPr>
-        <w:t>•  TTS. ElevenLabs was the most intelligible (0.32 round-trip WER) and lost no segments; strongest on Pidgin (0.09), weakest on Yoruba (0.53). Our fine-tuned TTS followed (0.49) - best Hausa of the three (0.27) but the highest hallucination rate (0.44), meaning it invents content. Sahara was last on WER (0.61) and is the only one to lose a segment outright (0.12), but it hallucinates least (0.23): it drops content rather than inventing it, which is the safer direction to fail in on a bank call. Its Igbo (0.33) was the best of any model on that language.</w:t>
+        <w:t>Sahara's pair code matters: yo is the Yoruba-English model, en is monolingual and discards the Yoruba silently. Our fine-tuned STT also hallucinated fluent sentences from silence during live testing.</w:t>
+      </w:r>
+    </w:p>
+    <w:p>
+      <w:r>
+        <w:rPr>
+          <w:i w:val="0"/>
+          <w:sz w:val="22"/>
+        </w:rPr>
+        <w:t>TTS: ElevenLabs most intelligible (0.32), best Pidgin (0.09), worst Yoruba (0.53). Our fine-tuned TTS second (0.49), best Hausa (0.27) but highest hallucination (0.44). Sahara last on WER (0.61) and the only one to lose a segment (0.12), but it hallucinates least (0.23) — it drops content rather than inventing it, the safer failure on a bank call — and had the best Igbo (0.33). Yoruba was hardest and Pidgin easiest in both directions, for every model.</w:t>
       </w:r>
     </w:p>
     <w:p>
       <w:pPr>
-        <w:spacing w:before="160" w:after="60"/>
+        <w:spacing w:before="180" w:after="40"/>
       </w:pPr>
       <w:r>
         <w:rPr>
           <w:b/>
           <w:color w:val="1A1A1A"/>
-          <w:sz w:val="24"/>
+          <w:sz w:val="26"/>
         </w:rPr>
         <w:t>7. What we shipped, and why</w:t>
       </w:r>
@@ -2354,41 +2439,23 @@
       <w:r>
         <w:rPr>
           <w:i w:val="0"/>
-          <w:sz w:val="18"/>
+          <w:sz w:val="22"/>
         </w:rPr>
-        <w:t>Sahara runs the live agents in both directions. It is not the top scorer on WER, but it is the only model that keeps both halves of a code-switched sentence, and an agent that loses the English half of “Mo ra data yen, but it never entered” cannot pick the right tool. Accuracy that discards the language the caller actually used is not accuracy for this product.</w:t>
+        <w:t>Sahara runs the live agents in both directions. It is not the top scorer on WER, but it is the only model that keeps both halves of a code-switched sentence, and an agent that loses the English half of “Mo ra data yen, but it never entered” cannot pick the right tool. Accuracy that discards the language the caller used is not accuracy for this product.</w:t>
       </w:r>
     </w:p>
     <w:p>
       <w:r>
         <w:rPr>
           <w:i w:val="0"/>
-          <w:sz w:val="18"/>
+          <w:sz w:val="22"/>
         </w:rPr>
-        <w:t>The cost is latency, and most of it was ours rather than the model's. Driving the streaming ASR the obvious way - buffer the utterance, commit, wait - left callers waiting 8.7 s. Opening the socket at start-of-speech, feeding it live and warming sessions during silence brought that to 4.1-5.9 s.</w:t>
-      </w:r>
-    </w:p>
-    <w:p>
-      <w:r>
-        <w:rPr>
-          <w:i w:val="0"/>
-          <w:sz w:val="18"/>
-        </w:rPr>
-        <w:t>On TTS the streaming endpoint allocates a session per call and the account runs out after about four, so a call went silent partway through. The non-streaming generate endpoint has no session at all: nine calls back to back without a failure, at roughly 5 s per reply. Replies are synthesised one sentence ahead of playback, so generation finishes before the audio it sits under - the three-sentence telco greeting needs 9.4 s of synthesis behind 16.4 s of speech, and plays without a gap.</w:t>
-      </w:r>
-    </w:p>
-    <w:p>
-      <w:r>
-        <w:rPr>
-          <w:i w:val="0"/>
-          <w:sz w:val="18"/>
-        </w:rPr>
-        <w:t>Two failures worth recording because neither was visible from the metrics. Text under ten characters comes back with the final full stop read aloud as the words “full stop”, so short replies are sent without it. And the agent’s own reply is streamed in fragments, so control tokens split across chunks and reached the caller as spoken words until the text was assembled into whole sentences before cleaning.</w:t>
+        <w:t>Most of the latency was ours, not the model's. Buffering each utterance before committing left callers waiting 8.7 s; opening the socket at start-of-speech and warming sessions during silence brought that to 4.1-5.9 s. On TTS the streaming endpoint allocates a session per call and the account runs out after about four, so calls went silent partway through — the non-streaming generate endpoint has none, and synthesising one sentence ahead of playback keeps the audio gapless.</w:t>
       </w:r>
     </w:p>
     <w:sectPr>
       <w:pgSz w:w="12240" w:h="15840"/>
-      <w:pgMar w:top="720" w:right="864" w:bottom="720" w:left="864" w:header="720" w:footer="720" w:gutter="0"/>
+      <w:pgMar w:top="864" w:right="1008" w:bottom="864" w:left="1008" w:header="720" w:footer="720" w:gutter="0"/>
       <w:cols w:space="720"/>
       <w:docGrid w:linePitch="360"/>
     </w:sectPr>
@@ -2760,11 +2827,11 @@
     <w:qFormat/>
     <w:rsid w:val="00FC693F"/>
     <w:pPr>
-      <w:spacing w:after="80" w:line="240" w:lineRule="auto"/>
+      <w:spacing w:after="100" w:line="240" w:lineRule="auto"/>
     </w:pPr>
     <w:rPr>
       <w:rFonts w:ascii="Calibri" w:hAnsi="Calibri"/>
-      <w:sz w:val="18"/>
+      <w:sz w:val="22"/>
     </w:rPr>
   </w:style>
   <w:style w:type="paragraph" w:styleId="Header">

</xml_diff>